<commit_message>
Update raw data URL to https://github.com/djmsritai-tech/QM640-Data-Analytics-Capstone/blob/main/data/raw/facility-2025.csv in report and README
</commit_message>
<xml_diff>
--- a/reports/QM 640_Interim_Report_DhananjayVerma-0291493.docx
+++ b/reports/QM 640_Interim_Report_DhananjayVerma-0291493.docx
@@ -162,7 +162,7 @@
           <w:b/>
           <w:sz w:val="22"/>
         </w:rPr>
-        <w:t xml:space="preserve">GitHub URL: </w:t>
+        <w:t xml:space="preserve">Project Repository: </w:t>
       </w:r>
       <w:r>
         <w:rPr>
@@ -170,7 +170,7 @@
           <w:i w:val="0"/>
           <w:sz w:val="22"/>
         </w:rPr>
-        <w:t>Project Repository: https://github.com/djmsritai-tech/QM640-Data-Analytics-Capstone</w:t>
+        <w:t>https://github.com/djmsritai-tech/QM640-Data-Analytics-Capstone</w:t>
       </w:r>
     </w:p>
     <w:p>
@@ -184,7 +184,7 @@
           <w:b/>
           <w:sz w:val="22"/>
         </w:rPr>
-        <w:t xml:space="preserve">Raw Dataset: </w:t>
+        <w:t xml:space="preserve">Raw Data URL: </w:t>
       </w:r>
       <w:r>
         <w:rPr>
@@ -192,7 +192,7 @@
           <w:i w:val="0"/>
           <w:sz w:val="22"/>
         </w:rPr>
-        <w:t>Raw Data Path: data/raw/facility-2025.csv (4,050 records, 30 EPA CAMPD attributes)</w:t>
+        <w:t>https://github.com/djmsritai-tech/QM640-Data-Analytics-Capstone/blob/main/data/raw/facility-2025.csv</w:t>
       </w:r>
     </w:p>
     <w:p>
@@ -206,7 +206,7 @@
           <w:b/>
           <w:sz w:val="22"/>
         </w:rPr>
-        <w:t xml:space="preserve">Clean Dataset: </w:t>
+        <w:t xml:space="preserve">Processed Data URL: </w:t>
       </w:r>
       <w:r>
         <w:rPr>
@@ -214,7 +214,7 @@
           <w:i w:val="0"/>
           <w:sz w:val="22"/>
         </w:rPr>
-        <w:t>Processed Data Path: data/processed/facility_clean_processed.csv (4,050 records, 45 engineered features)</w:t>
+        <w:t>https://github.com/djmsritai-tech/QM640-Data-Analytics-Capstone/blob/main/data/processed/facility_clean_processed.csv</w:t>
       </w:r>
     </w:p>
     <w:p>
@@ -228,7 +228,7 @@
           <w:b/>
           <w:sz w:val="22"/>
         </w:rPr>
-        <w:t xml:space="preserve">Python Source Code: </w:t>
+        <w:t xml:space="preserve">Code/Notebooks: </w:t>
       </w:r>
       <w:r>
         <w:rPr>
@@ -236,7 +236,7 @@
           <w:i w:val="0"/>
           <w:sz w:val="22"/>
         </w:rPr>
-        <w:t>Analysis &amp; Modeling Scripts: scripts/run_capstone_analytics.py, scripts/build_full_interim_report.py</w:t>
+        <w:t>https://github.com/djmsritai-tech/QM640-Data-Analytics-Capstone/tree/main/scripts</w:t>
       </w:r>
     </w:p>
     <w:p>
@@ -258,7 +258,7 @@
           <w:i w:val="0"/>
           <w:sz w:val="22"/>
         </w:rPr>
-        <w:t>Visualizations &amp; Figures: outputs/figures/ (10 APA 7 publication-grade figures at 300 DPI)</w:t>
+        <w:t>outputs/figures/ (10 APA 7 publication-grade figures at 300 DPI)</w:t>
       </w:r>
     </w:p>
     <w:p>
@@ -5463,7 +5463,103 @@
           <w:color w:val="19375F"/>
           <w:sz w:val="24"/>
         </w:rPr>
-        <w:t>Screenshots and Structural Evidence</w:t>
+        <w:t>GitHub Data Availability Statement</w:t>
+      </w:r>
+    </w:p>
+    <w:p>
+      <w:pPr>
+        <w:spacing w:after="120" w:line="276" w:lineRule="auto"/>
+        <w:jc w:val="left"/>
+      </w:pPr>
+      <w:r>
+        <w:rPr>
+          <w:rFonts w:ascii="Times New Roman" w:hAnsi="Times New Roman"/>
+          <w:i w:val="0"/>
+          <w:sz w:val="22"/>
+        </w:rPr>
+        <w:t>In accordance with university capstone requirements, the complete raw and processed datasets and Python notebooks/scripts are permanently maintained and available in the GitHub repository under:</w:t>
+      </w:r>
+    </w:p>
+    <w:p>
+      <w:pPr>
+        <w:spacing w:after="80" w:line="276" w:lineRule="auto"/>
+        <w:jc w:val="left"/>
+      </w:pPr>
+      <w:r>
+        <w:rPr>
+          <w:rFonts w:ascii="Times New Roman" w:hAnsi="Times New Roman"/>
+          <w:b/>
+          <w:sz w:val="22"/>
+        </w:rPr>
+        <w:t xml:space="preserve">Raw data: </w:t>
+      </w:r>
+      <w:r>
+        <w:rPr>
+          <w:rFonts w:ascii="Times New Roman" w:hAnsi="Times New Roman"/>
+          <w:i w:val="0"/>
+          <w:sz w:val="22"/>
+        </w:rPr>
+        <w:t>https://github.com/djmsritai-tech/QM640-Data-Analytics-Capstone/blob/main/data/raw/facility-2025.csv</w:t>
+      </w:r>
+    </w:p>
+    <w:p>
+      <w:pPr>
+        <w:spacing w:after="80" w:line="276" w:lineRule="auto"/>
+        <w:jc w:val="left"/>
+      </w:pPr>
+      <w:r>
+        <w:rPr>
+          <w:rFonts w:ascii="Times New Roman" w:hAnsi="Times New Roman"/>
+          <w:b/>
+          <w:sz w:val="22"/>
+        </w:rPr>
+        <w:t xml:space="preserve">Processed/clean data: </w:t>
+      </w:r>
+      <w:r>
+        <w:rPr>
+          <w:rFonts w:ascii="Times New Roman" w:hAnsi="Times New Roman"/>
+          <w:i w:val="0"/>
+          <w:sz w:val="22"/>
+        </w:rPr>
+        <w:t>https://github.com/djmsritai-tech/QM640-Data-Analytics-Capstone/blob/main/data/processed/facility_clean_processed.csv</w:t>
+      </w:r>
+    </w:p>
+    <w:p>
+      <w:pPr>
+        <w:spacing w:after="200" w:line="276" w:lineRule="auto"/>
+        <w:jc w:val="left"/>
+      </w:pPr>
+      <w:r>
+        <w:rPr>
+          <w:rFonts w:ascii="Times New Roman" w:hAnsi="Times New Roman"/>
+          <w:b/>
+          <w:sz w:val="22"/>
+        </w:rPr>
+        <w:t xml:space="preserve">Code/notebooks: </w:t>
+      </w:r>
+      <w:r>
+        <w:rPr>
+          <w:rFonts w:ascii="Times New Roman" w:hAnsi="Times New Roman"/>
+          <w:i w:val="0"/>
+          <w:sz w:val="22"/>
+        </w:rPr>
+        <w:t>https://github.com/djmsritai-tech/QM640-Data-Analytics-Capstone/tree/main/scripts</w:t>
+      </w:r>
+    </w:p>
+    <w:p>
+      <w:pPr>
+        <w:keepNext/>
+        <w:spacing w:before="240" w:after="120"/>
+        <w:jc w:val="left"/>
+      </w:pPr>
+      <w:r>
+        <w:rPr>
+          <w:rFonts w:ascii="Times New Roman" w:hAnsi="Times New Roman"/>
+          <w:b/>
+          <w:color w:val="19375F"/>
+          <w:sz w:val="24"/>
+        </w:rPr>
+        <w:t>Screenshots / Evidence (as required)</w:t>
       </w:r>
     </w:p>
     <w:p>

</xml_diff>

<commit_message>
Add Table 3: Analytical Model Record Allocation (4,050 units, 3,240 train, 810 holdout test), renumber Tables 4-9 sequentially, and update Word and PDF reports
</commit_message>
<xml_diff>
--- a/reports/QM 640_Interim_Report_DhananjayVerma-0291493.docx
+++ b/reports/QM 640_Interim_Report_DhananjayVerma-0291493.docx
@@ -5463,6 +5463,814 @@
           <w:color w:val="19375F"/>
           <w:sz w:val="24"/>
         </w:rPr>
+        <w:t>Sample Size Justification &amp; Analytical Record Allocation across Models</w:t>
+      </w:r>
+    </w:p>
+    <w:p>
+      <w:pPr>
+        <w:spacing w:after="120" w:line="276" w:lineRule="auto"/>
+        <w:jc w:val="left"/>
+      </w:pPr>
+      <w:r>
+        <w:rPr>
+          <w:rFonts w:ascii="Times New Roman" w:hAnsi="Times New Roman"/>
+          <w:i w:val="0"/>
+          <w:sz w:val="22"/>
+        </w:rPr>
+        <w:t>A foundational methodological strength of this capstone research is that modeling and statistical inferences were conducted on the complete national fleet of 4,050 generating units across 1,328 unique facilities, representing 100% of regulated units in facility-2025.csv with zero records discarded. In accordance with the sampling methodology established in the capstone synopsis, statistical power calculations (Cohen, 1988; Cochran, 1977) confirm that the 4,050 records exceed the minimum sample size requirements for each analytical model by an order of magnitude.</w:t>
+      </w:r>
+    </w:p>
+    <w:p>
+      <w:pPr>
+        <w:spacing w:after="120" w:line="276" w:lineRule="auto"/>
+        <w:jc w:val="left"/>
+      </w:pPr>
+      <w:r>
+        <w:rPr>
+          <w:rFonts w:ascii="Times New Roman" w:hAnsi="Times New Roman"/>
+          <w:i w:val="0"/>
+          <w:sz w:val="22"/>
+        </w:rPr>
+        <w:t>For RQ1, group comparisons across fuel categories require a minimum of 30 observations per group (rule of thumb) and an aggregate sample of 159–180 units for medium effect size (f = 0.25, power = 80%, α = 0.05); the available 4,050 units exceed this threshold by over 22-fold. For RQ2, predictive classification guidelines dictate 10–20 observations per candidate predictor per class (minimum 120–240 units for 6–12 predictors); our stratified partitioning allocates 3,240 records (80%) to the training set with 5-fold cross-validation and preserves 810 records (20%) as a holdout test set (containing 204 actual high emitters and 606 low emitters), ensuring exceptional model stability and preventing data leakage. For RQ3, linear and multivariate regressions require 300–800 records for small-to-medium effect detection; all 4,050 units are utilized (degrees of freedom = 4,046). For RQ4, unsupervised clustering heuristics require at least 10× the feature count (≥ 300 units); K-Means is executed across the entire 4,050-unit fleet. Table 3 details the exact record allocation across all models.</w:t>
+      </w:r>
+    </w:p>
+    <w:tbl>
+      <w:tblPr>
+        <w:tblW w:type="auto" w:w="0"/>
+        <w:tblLook w:firstColumn="1" w:firstRow="1" w:lastColumn="0" w:lastRow="0" w:noHBand="0" w:noVBand="1" w:val="04A0"/>
+        <w:jc w:val="center"/>
+        <w:tblBorders>
+          <w:top w:val="single" w:sz="12" w:space="0" w:color="000000"/>
+          <w:bottom w:val="single" w:sz="12" w:space="0" w:color="000000"/>
+          <w:insideH w:val="single" w:sz="4" w:space="0" w:color="E5E5E5"/>
+          <w:insideV w:val="none"/>
+          <w:left w:val="none"/>
+          <w:right w:val="none"/>
+        </w:tblBorders>
+      </w:tblPr>
+      <w:tblGrid>
+        <w:gridCol w:w="1337"/>
+        <w:gridCol w:w="1337"/>
+        <w:gridCol w:w="1337"/>
+        <w:gridCol w:w="1337"/>
+        <w:gridCol w:w="1337"/>
+        <w:gridCol w:w="1337"/>
+        <w:gridCol w:w="1337"/>
+      </w:tblGrid>
+      <w:tr>
+        <w:trPr>
+          <w:tblHeader/>
+        </w:trPr>
+        <w:tc>
+          <w:tcPr>
+            <w:tcW w:type="dxa" w:w="1728"/>
+            <w:tcBorders>
+              <w:bottom w:val="single" w:sz="12" w:space="0" w:color="000000"/>
+            </w:tcBorders>
+            <w:shd w:fill="F4F6F8"/>
+          </w:tcPr>
+          <w:p>
+            <w:pPr>
+              <w:spacing w:before="60" w:after="60" w:line="240" w:lineRule="auto"/>
+              <w:jc w:val="center"/>
+            </w:pPr>
+            <w:r>
+              <w:rPr>
+                <w:rFonts w:ascii="Times New Roman" w:hAnsi="Times New Roman"/>
+                <w:b/>
+                <w:sz w:val="19"/>
+              </w:rPr>
+              <w:t>Research Question &amp; Scope</w:t>
+            </w:r>
+          </w:p>
+        </w:tc>
+        <w:tc>
+          <w:tcPr>
+            <w:tcW w:type="dxa" w:w="1584"/>
+            <w:tcBorders>
+              <w:bottom w:val="single" w:sz="12" w:space="0" w:color="000000"/>
+            </w:tcBorders>
+            <w:shd w:fill="F4F6F8"/>
+          </w:tcPr>
+          <w:p>
+            <w:pPr>
+              <w:spacing w:before="60" w:after="60" w:line="240" w:lineRule="auto"/>
+              <w:jc w:val="center"/>
+            </w:pPr>
+            <w:r>
+              <w:rPr>
+                <w:rFonts w:ascii="Times New Roman" w:hAnsi="Times New Roman"/>
+                <w:b/>
+                <w:sz w:val="19"/>
+              </w:rPr>
+              <w:t>Analytical Model</w:t>
+            </w:r>
+          </w:p>
+        </w:tc>
+        <w:tc>
+          <w:tcPr>
+            <w:tcW w:type="dxa" w:w="1152"/>
+            <w:tcBorders>
+              <w:bottom w:val="single" w:sz="12" w:space="0" w:color="000000"/>
+            </w:tcBorders>
+            <w:shd w:fill="F4F6F8"/>
+          </w:tcPr>
+          <w:p>
+            <w:pPr>
+              <w:spacing w:before="60" w:after="60" w:line="240" w:lineRule="auto"/>
+              <w:jc w:val="center"/>
+            </w:pPr>
+            <w:r>
+              <w:rPr>
+                <w:rFonts w:ascii="Times New Roman" w:hAnsi="Times New Roman"/>
+                <w:b/>
+                <w:sz w:val="19"/>
+              </w:rPr>
+              <w:t>Total Records</w:t>
+            </w:r>
+          </w:p>
+        </w:tc>
+        <w:tc>
+          <w:tcPr>
+            <w:tcW w:type="dxa" w:w="1296"/>
+            <w:tcBorders>
+              <w:bottom w:val="single" w:sz="12" w:space="0" w:color="000000"/>
+            </w:tcBorders>
+            <w:shd w:fill="F4F6F8"/>
+          </w:tcPr>
+          <w:p>
+            <w:pPr>
+              <w:spacing w:before="60" w:after="60" w:line="240" w:lineRule="auto"/>
+              <w:jc w:val="center"/>
+            </w:pPr>
+            <w:r>
+              <w:rPr>
+                <w:rFonts w:ascii="Times New Roman" w:hAnsi="Times New Roman"/>
+                <w:b/>
+                <w:sz w:val="19"/>
+              </w:rPr>
+              <w:t>Training Set</w:t>
+            </w:r>
+          </w:p>
+        </w:tc>
+        <w:tc>
+          <w:tcPr>
+            <w:tcW w:type="dxa" w:w="1584"/>
+            <w:tcBorders>
+              <w:bottom w:val="single" w:sz="12" w:space="0" w:color="000000"/>
+            </w:tcBorders>
+            <w:shd w:fill="F4F6F8"/>
+          </w:tcPr>
+          <w:p>
+            <w:pPr>
+              <w:spacing w:before="60" w:after="60" w:line="240" w:lineRule="auto"/>
+              <w:jc w:val="center"/>
+            </w:pPr>
+            <w:r>
+              <w:rPr>
+                <w:rFonts w:ascii="Times New Roman" w:hAnsi="Times New Roman"/>
+                <w:b/>
+                <w:sz w:val="19"/>
+              </w:rPr>
+              <w:t>Validation / Holdout</w:t>
+            </w:r>
+          </w:p>
+        </w:tc>
+        <w:tc>
+          <w:tcPr>
+            <w:tcW w:type="dxa" w:w="1440"/>
+            <w:tcBorders>
+              <w:bottom w:val="single" w:sz="12" w:space="0" w:color="000000"/>
+            </w:tcBorders>
+            <w:shd w:fill="F4F6F8"/>
+          </w:tcPr>
+          <w:p>
+            <w:pPr>
+              <w:spacing w:before="60" w:after="60" w:line="240" w:lineRule="auto"/>
+              <w:jc w:val="center"/>
+            </w:pPr>
+            <w:r>
+              <w:rPr>
+                <w:rFonts w:ascii="Times New Roman" w:hAnsi="Times New Roman"/>
+                <w:b/>
+                <w:sz w:val="19"/>
+              </w:rPr>
+              <w:t>Minimum Needed (Power)</w:t>
+            </w:r>
+          </w:p>
+        </w:tc>
+        <w:tc>
+          <w:tcPr>
+            <w:tcW w:type="dxa" w:w="1584"/>
+            <w:tcBorders>
+              <w:bottom w:val="single" w:sz="12" w:space="0" w:color="000000"/>
+            </w:tcBorders>
+            <w:shd w:fill="F4F6F8"/>
+          </w:tcPr>
+          <w:p>
+            <w:pPr>
+              <w:spacing w:before="60" w:after="60" w:line="240" w:lineRule="auto"/>
+              <w:jc w:val="center"/>
+            </w:pPr>
+            <w:r>
+              <w:rPr>
+                <w:rFonts w:ascii="Times New Roman" w:hAnsi="Times New Roman"/>
+                <w:b/>
+                <w:sz w:val="19"/>
+              </w:rPr>
+              <w:t>Statistical Power Evaluation</w:t>
+            </w:r>
+          </w:p>
+        </w:tc>
+      </w:tr>
+      <w:tr>
+        <w:tc>
+          <w:tcPr>
+            <w:tcW w:type="dxa" w:w="1728"/>
+          </w:tcPr>
+          <w:p>
+            <w:pPr>
+              <w:spacing w:before="40" w:after="40" w:line="252" w:lineRule="auto"/>
+              <w:jc w:val="left"/>
+            </w:pPr>
+            <w:r>
+              <w:rPr>
+                <w:rFonts w:ascii="Times New Roman" w:hAnsi="Times New Roman"/>
+                <w:sz w:val="18"/>
+              </w:rPr>
+              <w:t>RQ1: Emission &amp; Heat Input Variability across Fuel Types</w:t>
+            </w:r>
+          </w:p>
+        </w:tc>
+        <w:tc>
+          <w:tcPr>
+            <w:tcW w:type="dxa" w:w="1584"/>
+          </w:tcPr>
+          <w:p>
+            <w:pPr>
+              <w:spacing w:before="40" w:after="40" w:line="252" w:lineRule="auto"/>
+              <w:jc w:val="left"/>
+            </w:pPr>
+            <w:r>
+              <w:rPr>
+                <w:rFonts w:ascii="Times New Roman" w:hAnsi="Times New Roman"/>
+                <w:sz w:val="18"/>
+              </w:rPr>
+              <w:t>One-Way ANOVA &amp; Kruskal-Wallis Test</w:t>
+            </w:r>
+          </w:p>
+        </w:tc>
+        <w:tc>
+          <w:tcPr>
+            <w:tcW w:type="dxa" w:w="1152"/>
+          </w:tcPr>
+          <w:p>
+            <w:pPr>
+              <w:spacing w:before="40" w:after="40" w:line="252" w:lineRule="auto"/>
+              <w:jc w:val="left"/>
+            </w:pPr>
+            <w:r>
+              <w:rPr>
+                <w:rFonts w:ascii="Times New Roman" w:hAnsi="Times New Roman"/>
+                <w:sz w:val="18"/>
+              </w:rPr>
+              <w:t>4,050 records (100%)</w:t>
+            </w:r>
+          </w:p>
+        </w:tc>
+        <w:tc>
+          <w:tcPr>
+            <w:tcW w:type="dxa" w:w="1296"/>
+          </w:tcPr>
+          <w:p>
+            <w:pPr>
+              <w:spacing w:before="40" w:after="40" w:line="252" w:lineRule="auto"/>
+              <w:jc w:val="left"/>
+            </w:pPr>
+            <w:r>
+              <w:rPr>
+                <w:rFonts w:ascii="Times New Roman" w:hAnsi="Times New Roman"/>
+                <w:sz w:val="18"/>
+              </w:rPr>
+              <w:t>4,050 records (Full population)</w:t>
+            </w:r>
+          </w:p>
+        </w:tc>
+        <w:tc>
+          <w:tcPr>
+            <w:tcW w:type="dxa" w:w="1584"/>
+          </w:tcPr>
+          <w:p>
+            <w:pPr>
+              <w:spacing w:before="40" w:after="40" w:line="252" w:lineRule="auto"/>
+              <w:jc w:val="left"/>
+            </w:pPr>
+            <w:r>
+              <w:rPr>
+                <w:rFonts w:ascii="Times New Roman" w:hAnsi="Times New Roman"/>
+                <w:sz w:val="18"/>
+              </w:rPr>
+              <w:t>N/A (Omnibus inference)</w:t>
+            </w:r>
+          </w:p>
+        </w:tc>
+        <w:tc>
+          <w:tcPr>
+            <w:tcW w:type="dxa" w:w="1440"/>
+          </w:tcPr>
+          <w:p>
+            <w:pPr>
+              <w:spacing w:before="40" w:after="40" w:line="252" w:lineRule="auto"/>
+              <w:jc w:val="left"/>
+            </w:pPr>
+            <w:r>
+              <w:rPr>
+                <w:rFonts w:ascii="Times New Roman" w:hAnsi="Times New Roman"/>
+                <w:sz w:val="18"/>
+              </w:rPr>
+              <w:t>159–180 units (f = 0.25, power = 80%)</w:t>
+            </w:r>
+          </w:p>
+        </w:tc>
+        <w:tc>
+          <w:tcPr>
+            <w:tcW w:type="dxa" w:w="1584"/>
+          </w:tcPr>
+          <w:p>
+            <w:pPr>
+              <w:spacing w:before="40" w:after="40" w:line="252" w:lineRule="auto"/>
+              <w:jc w:val="left"/>
+            </w:pPr>
+            <w:r>
+              <w:rPr>
+                <w:rFonts w:ascii="Times New Roman" w:hAnsi="Times New Roman"/>
+                <w:sz w:val="18"/>
+              </w:rPr>
+              <w:t>Exceeds minimum by &gt;22×; highly robust to non-normality.</w:t>
+            </w:r>
+          </w:p>
+        </w:tc>
+      </w:tr>
+      <w:tr>
+        <w:tc>
+          <w:tcPr>
+            <w:tcW w:type="dxa" w:w="1728"/>
+            <w:shd w:fill="FAFAFA"/>
+          </w:tcPr>
+          <w:p>
+            <w:pPr>
+              <w:spacing w:before="40" w:after="40" w:line="252" w:lineRule="auto"/>
+              <w:jc w:val="left"/>
+            </w:pPr>
+            <w:r>
+              <w:rPr>
+                <w:rFonts w:ascii="Times New Roman" w:hAnsi="Times New Roman"/>
+                <w:sz w:val="18"/>
+              </w:rPr>
+              <w:t>RQ2: Predictive Classification of High-Emission Units</w:t>
+            </w:r>
+          </w:p>
+        </w:tc>
+        <w:tc>
+          <w:tcPr>
+            <w:tcW w:type="dxa" w:w="1584"/>
+            <w:shd w:fill="FAFAFA"/>
+          </w:tcPr>
+          <w:p>
+            <w:pPr>
+              <w:spacing w:before="40" w:after="40" w:line="252" w:lineRule="auto"/>
+              <w:jc w:val="left"/>
+            </w:pPr>
+            <w:r>
+              <w:rPr>
+                <w:rFonts w:ascii="Times New Roman" w:hAnsi="Times New Roman"/>
+                <w:sz w:val="18"/>
+              </w:rPr>
+              <w:t>Random Forest, Gradient Boosting, Logistic Regression</w:t>
+            </w:r>
+          </w:p>
+        </w:tc>
+        <w:tc>
+          <w:tcPr>
+            <w:tcW w:type="dxa" w:w="1152"/>
+            <w:shd w:fill="FAFAFA"/>
+          </w:tcPr>
+          <w:p>
+            <w:pPr>
+              <w:spacing w:before="40" w:after="40" w:line="252" w:lineRule="auto"/>
+              <w:jc w:val="left"/>
+            </w:pPr>
+            <w:r>
+              <w:rPr>
+                <w:rFonts w:ascii="Times New Roman" w:hAnsi="Times New Roman"/>
+                <w:sz w:val="18"/>
+              </w:rPr>
+              <w:t>4,050 records (100%)</w:t>
+            </w:r>
+          </w:p>
+        </w:tc>
+        <w:tc>
+          <w:tcPr>
+            <w:tcW w:type="dxa" w:w="1296"/>
+            <w:shd w:fill="FAFAFA"/>
+          </w:tcPr>
+          <w:p>
+            <w:pPr>
+              <w:spacing w:before="40" w:after="40" w:line="252" w:lineRule="auto"/>
+              <w:jc w:val="left"/>
+            </w:pPr>
+            <w:r>
+              <w:rPr>
+                <w:rFonts w:ascii="Times New Roman" w:hAnsi="Times New Roman"/>
+                <w:sz w:val="18"/>
+              </w:rPr>
+              <w:t>3,240 records (80% stratified)</w:t>
+            </w:r>
+          </w:p>
+        </w:tc>
+        <w:tc>
+          <w:tcPr>
+            <w:tcW w:type="dxa" w:w="1584"/>
+            <w:shd w:fill="FAFAFA"/>
+          </w:tcPr>
+          <w:p>
+            <w:pPr>
+              <w:spacing w:before="40" w:after="40" w:line="252" w:lineRule="auto"/>
+              <w:jc w:val="left"/>
+            </w:pPr>
+            <w:r>
+              <w:rPr>
+                <w:rFonts w:ascii="Times New Roman" w:hAnsi="Times New Roman"/>
+                <w:sz w:val="18"/>
+              </w:rPr>
+              <w:t>810 records (20% holdout: 204 High / 606 Low)</w:t>
+            </w:r>
+          </w:p>
+        </w:tc>
+        <w:tc>
+          <w:tcPr>
+            <w:tcW w:type="dxa" w:w="1440"/>
+            <w:shd w:fill="FAFAFA"/>
+          </w:tcPr>
+          <w:p>
+            <w:pPr>
+              <w:spacing w:before="40" w:after="40" w:line="252" w:lineRule="auto"/>
+              <w:jc w:val="left"/>
+            </w:pPr>
+            <w:r>
+              <w:rPr>
+                <w:rFonts w:ascii="Times New Roman" w:hAnsi="Times New Roman"/>
+                <w:sz w:val="18"/>
+              </w:rPr>
+              <w:t>120–240 units (10–20 per predictor/class)</w:t>
+            </w:r>
+          </w:p>
+        </w:tc>
+        <w:tc>
+          <w:tcPr>
+            <w:tcW w:type="dxa" w:w="1584"/>
+            <w:shd w:fill="FAFAFA"/>
+          </w:tcPr>
+          <w:p>
+            <w:pPr>
+              <w:spacing w:before="40" w:after="40" w:line="252" w:lineRule="auto"/>
+              <w:jc w:val="left"/>
+            </w:pPr>
+            <w:r>
+              <w:rPr>
+                <w:rFonts w:ascii="Times New Roman" w:hAnsi="Times New Roman"/>
+                <w:sz w:val="18"/>
+              </w:rPr>
+              <w:t>Exceeds minimum by &gt;13×; 5-fold CV ensures generalizability without leakage.</w:t>
+            </w:r>
+          </w:p>
+        </w:tc>
+      </w:tr>
+      <w:tr>
+        <w:tc>
+          <w:tcPr>
+            <w:tcW w:type="dxa" w:w="1728"/>
+          </w:tcPr>
+          <w:p>
+            <w:pPr>
+              <w:spacing w:before="40" w:after="40" w:line="252" w:lineRule="auto"/>
+              <w:jc w:val="left"/>
+            </w:pPr>
+            <w:r>
+              <w:rPr>
+                <w:rFonts w:ascii="Times New Roman" w:hAnsi="Times New Roman"/>
+                <w:sz w:val="18"/>
+              </w:rPr>
+              <w:t>RQ3: Unit Age and Operational Thermal Intensity</w:t>
+            </w:r>
+          </w:p>
+        </w:tc>
+        <w:tc>
+          <w:tcPr>
+            <w:tcW w:type="dxa" w:w="1584"/>
+          </w:tcPr>
+          <w:p>
+            <w:pPr>
+              <w:spacing w:before="40" w:after="40" w:line="252" w:lineRule="auto"/>
+              <w:jc w:val="left"/>
+            </w:pPr>
+            <w:r>
+              <w:rPr>
+                <w:rFonts w:ascii="Times New Roman" w:hAnsi="Times New Roman"/>
+                <w:sz w:val="18"/>
+              </w:rPr>
+              <w:t>Bivariate &amp; Multivariate OLS Regressions</w:t>
+            </w:r>
+          </w:p>
+        </w:tc>
+        <w:tc>
+          <w:tcPr>
+            <w:tcW w:type="dxa" w:w="1152"/>
+          </w:tcPr>
+          <w:p>
+            <w:pPr>
+              <w:spacing w:before="40" w:after="40" w:line="252" w:lineRule="auto"/>
+              <w:jc w:val="left"/>
+            </w:pPr>
+            <w:r>
+              <w:rPr>
+                <w:rFonts w:ascii="Times New Roman" w:hAnsi="Times New Roman"/>
+                <w:sz w:val="18"/>
+              </w:rPr>
+              <w:t>4,050 records (100%)</w:t>
+            </w:r>
+          </w:p>
+        </w:tc>
+        <w:tc>
+          <w:tcPr>
+            <w:tcW w:type="dxa" w:w="1296"/>
+          </w:tcPr>
+          <w:p>
+            <w:pPr>
+              <w:spacing w:before="40" w:after="40" w:line="252" w:lineRule="auto"/>
+              <w:jc w:val="left"/>
+            </w:pPr>
+            <w:r>
+              <w:rPr>
+                <w:rFonts w:ascii="Times New Roman" w:hAnsi="Times New Roman"/>
+                <w:sz w:val="18"/>
+              </w:rPr>
+              <w:t>4,050 records (Full population)</w:t>
+            </w:r>
+          </w:p>
+        </w:tc>
+        <w:tc>
+          <w:tcPr>
+            <w:tcW w:type="dxa" w:w="1584"/>
+          </w:tcPr>
+          <w:p>
+            <w:pPr>
+              <w:spacing w:before="40" w:after="40" w:line="252" w:lineRule="auto"/>
+              <w:jc w:val="left"/>
+            </w:pPr>
+            <w:r>
+              <w:rPr>
+                <w:rFonts w:ascii="Times New Roman" w:hAnsi="Times New Roman"/>
+                <w:sz w:val="18"/>
+              </w:rPr>
+              <w:t>N/A (df = 4,046; residual diagnostics)</w:t>
+            </w:r>
+          </w:p>
+        </w:tc>
+        <w:tc>
+          <w:tcPr>
+            <w:tcW w:type="dxa" w:w="1440"/>
+          </w:tcPr>
+          <w:p>
+            <w:pPr>
+              <w:spacing w:before="40" w:after="40" w:line="252" w:lineRule="auto"/>
+              <w:jc w:val="left"/>
+            </w:pPr>
+            <w:r>
+              <w:rPr>
+                <w:rFonts w:ascii="Times New Roman" w:hAnsi="Times New Roman"/>
+                <w:sz w:val="18"/>
+              </w:rPr>
+              <w:t>300–800 units (Small-medium effect, r ≈ 0.1-0.3)</w:t>
+            </w:r>
+          </w:p>
+        </w:tc>
+        <w:tc>
+          <w:tcPr>
+            <w:tcW w:type="dxa" w:w="1584"/>
+          </w:tcPr>
+          <w:p>
+            <w:pPr>
+              <w:spacing w:before="40" w:after="40" w:line="252" w:lineRule="auto"/>
+              <w:jc w:val="left"/>
+            </w:pPr>
+            <w:r>
+              <w:rPr>
+                <w:rFonts w:ascii="Times New Roman" w:hAnsi="Times New Roman"/>
+                <w:sz w:val="18"/>
+              </w:rPr>
+              <w:t>Exceeds minimum by &gt;5×; highly stable parameter standard errors.</w:t>
+            </w:r>
+          </w:p>
+        </w:tc>
+      </w:tr>
+      <w:tr>
+        <w:tc>
+          <w:tcPr>
+            <w:tcW w:type="dxa" w:w="1728"/>
+            <w:shd w:fill="FAFAFA"/>
+          </w:tcPr>
+          <w:p>
+            <w:pPr>
+              <w:spacing w:before="40" w:after="40" w:line="252" w:lineRule="auto"/>
+              <w:jc w:val="left"/>
+            </w:pPr>
+            <w:r>
+              <w:rPr>
+                <w:rFonts w:ascii="Times New Roman" w:hAnsi="Times New Roman"/>
+                <w:sz w:val="18"/>
+              </w:rPr>
+              <w:t>RQ4: Unsupervised Fleet Segmentation &amp; Archetype Profiling</w:t>
+            </w:r>
+          </w:p>
+        </w:tc>
+        <w:tc>
+          <w:tcPr>
+            <w:tcW w:type="dxa" w:w="1584"/>
+            <w:shd w:fill="FAFAFA"/>
+          </w:tcPr>
+          <w:p>
+            <w:pPr>
+              <w:spacing w:before="40" w:after="40" w:line="252" w:lineRule="auto"/>
+              <w:jc w:val="left"/>
+            </w:pPr>
+            <w:r>
+              <w:rPr>
+                <w:rFonts w:ascii="Times New Roman" w:hAnsi="Times New Roman"/>
+                <w:sz w:val="18"/>
+              </w:rPr>
+              <w:t>K-Means Clustering &amp; 2D Principal Component Analysis</w:t>
+            </w:r>
+          </w:p>
+        </w:tc>
+        <w:tc>
+          <w:tcPr>
+            <w:tcW w:type="dxa" w:w="1152"/>
+            <w:shd w:fill="FAFAFA"/>
+          </w:tcPr>
+          <w:p>
+            <w:pPr>
+              <w:spacing w:before="40" w:after="40" w:line="252" w:lineRule="auto"/>
+              <w:jc w:val="left"/>
+            </w:pPr>
+            <w:r>
+              <w:rPr>
+                <w:rFonts w:ascii="Times New Roman" w:hAnsi="Times New Roman"/>
+                <w:sz w:val="18"/>
+              </w:rPr>
+              <w:t>4,050 records (100%)</w:t>
+            </w:r>
+          </w:p>
+        </w:tc>
+        <w:tc>
+          <w:tcPr>
+            <w:tcW w:type="dxa" w:w="1296"/>
+            <w:shd w:fill="FAFAFA"/>
+          </w:tcPr>
+          <w:p>
+            <w:pPr>
+              <w:spacing w:before="40" w:after="40" w:line="252" w:lineRule="auto"/>
+              <w:jc w:val="left"/>
+            </w:pPr>
+            <w:r>
+              <w:rPr>
+                <w:rFonts w:ascii="Times New Roman" w:hAnsi="Times New Roman"/>
+                <w:sz w:val="18"/>
+              </w:rPr>
+              <w:t>4,050 records (Full population)</w:t>
+            </w:r>
+          </w:p>
+        </w:tc>
+        <w:tc>
+          <w:tcPr>
+            <w:tcW w:type="dxa" w:w="1584"/>
+            <w:shd w:fill="FAFAFA"/>
+          </w:tcPr>
+          <w:p>
+            <w:pPr>
+              <w:spacing w:before="40" w:after="40" w:line="252" w:lineRule="auto"/>
+              <w:jc w:val="left"/>
+            </w:pPr>
+            <w:r>
+              <w:rPr>
+                <w:rFonts w:ascii="Times New Roman" w:hAnsi="Times New Roman"/>
+                <w:sz w:val="18"/>
+              </w:rPr>
+              <w:t>N/A (Fleet-wide centroid optimization)</w:t>
+            </w:r>
+          </w:p>
+        </w:tc>
+        <w:tc>
+          <w:tcPr>
+            <w:tcW w:type="dxa" w:w="1440"/>
+            <w:shd w:fill="FAFAFA"/>
+          </w:tcPr>
+          <w:p>
+            <w:pPr>
+              <w:spacing w:before="40" w:after="40" w:line="252" w:lineRule="auto"/>
+              <w:jc w:val="left"/>
+            </w:pPr>
+            <w:r>
+              <w:rPr>
+                <w:rFonts w:ascii="Times New Roman" w:hAnsi="Times New Roman"/>
+                <w:sz w:val="18"/>
+              </w:rPr>
+              <w:t>≥ 300 units (≥ 10× feature count rule)</w:t>
+            </w:r>
+          </w:p>
+        </w:tc>
+        <w:tc>
+          <w:tcPr>
+            <w:tcW w:type="dxa" w:w="1584"/>
+            <w:shd w:fill="FAFAFA"/>
+          </w:tcPr>
+          <w:p>
+            <w:pPr>
+              <w:spacing w:before="40" w:after="40" w:line="252" w:lineRule="auto"/>
+              <w:jc w:val="left"/>
+            </w:pPr>
+            <w:r>
+              <w:rPr>
+                <w:rFonts w:ascii="Times New Roman" w:hAnsi="Times New Roman"/>
+                <w:sz w:val="18"/>
+              </w:rPr>
+              <w:t>Exceeds minimum by &gt;13×; stable centroid formation and silhouette.</w:t>
+            </w:r>
+          </w:p>
+        </w:tc>
+      </w:tr>
+    </w:tbl>
+    <w:p>
+      <w:pPr>
+        <w:keepNext/>
+        <w:spacing w:before="240" w:after="40"/>
+      </w:pPr>
+      <w:r>
+        <w:rPr>
+          <w:rFonts w:ascii="Times New Roman" w:hAnsi="Times New Roman"/>
+          <w:b/>
+          <w:sz w:val="22"/>
+        </w:rPr>
+        <w:t>Table 3</w:t>
+      </w:r>
+    </w:p>
+    <w:p>
+      <w:pPr>
+        <w:keepNext/>
+        <w:spacing w:before="0" w:after="120"/>
+      </w:pPr>
+      <w:r>
+        <w:rPr>
+          <w:rFonts w:ascii="Times New Roman" w:hAnsi="Times New Roman"/>
+          <w:i/>
+          <w:sz w:val="22"/>
+        </w:rPr>
+        <w:t>Analytical Model Record Allocation and Sample Size Justification</w:t>
+      </w:r>
+    </w:p>
+    <w:p>
+      <w:pPr>
+        <w:spacing w:before="60" w:after="240"/>
+      </w:pPr>
+      <w:r>
+        <w:rPr>
+          <w:rFonts w:ascii="Times New Roman" w:hAnsi="Times New Roman"/>
+          <w:i/>
+          <w:sz w:val="18"/>
+        </w:rPr>
+        <w:t xml:space="preserve">Note. </w:t>
+      </w:r>
+      <w:r>
+        <w:rPr>
+          <w:rFonts w:ascii="Times New Roman" w:hAnsi="Times New Roman"/>
+          <w:sz w:val="18"/>
+        </w:rPr>
+        <w:t>Comprehensive allocation of records across models confirming 100% data preservation (zero records discarded) and statistical power adequacy.</w:t>
+      </w:r>
+    </w:p>
+    <w:p>
+      <w:pPr>
+        <w:keepNext/>
+        <w:spacing w:before="240" w:after="120"/>
+        <w:jc w:val="left"/>
+      </w:pPr>
+      <w:r>
+        <w:rPr>
+          <w:rFonts w:ascii="Times New Roman" w:hAnsi="Times New Roman"/>
+          <w:b/>
+          <w:color w:val="19375F"/>
+          <w:sz w:val="24"/>
+        </w:rPr>
         <w:t>GitHub Data Availability Statement</w:t>
       </w:r>
     </w:p>
@@ -5699,7 +6507,7 @@
           <w:i w:val="0"/>
           <w:sz w:val="22"/>
         </w:rPr>
-        <w:t>Rigorous data cleaning and preprocessing protocols were instituted to resolve data quality anomalies, structural formatting irregularities, and missing values inherent in regulatory filings. Table 3 enumerates the complete data cleaning log, specifying the anomaly detected, variables impacted, detection methodology, corrective treatment applied, and theoretical rationale.</w:t>
+        <w:t>Rigorous data cleaning and preprocessing protocols were instituted to resolve data quality anomalies, structural formatting irregularities, and missing values inherent in regulatory filings. Table 4 enumerates the complete data cleaning log, specifying the anomaly detected, variables impacted, detection methodology, corrective treatment applied, and theoretical rationale.</w:t>
       </w:r>
     </w:p>
     <w:tbl>
@@ -6611,7 +7419,7 @@
           <w:b/>
           <w:sz w:val="22"/>
         </w:rPr>
-        <w:t>Table 3</w:t>
+        <w:t>Table 4</w:t>
       </w:r>
     </w:p>
     <w:p>
@@ -7090,6 +7898,20 @@
         <w:t>Figure 4 provides a bivariate Pearson correlation matrix summarizing linear interdependencies among operational variables. Maximum hourly heat input rate is powerfully and positively correlated with installed electrical generation capacity (r = 0.869, p &lt; 0.001), establishing that thermal combustion requirements scale in near-linear proportionality with megawatt output. Heat input rate also correlates moderately with pollution control count (r = 0.354, p &lt; 0.001) and unit age (r = 0.119, p &lt; 0.001), reflecting the historical reality that larger and older steam units were retrofitted with multi-stage control technologies under Clean Air Act mandates. Importantly, multicollinearity diagnostics indicate that while capacity and heat input rate are closely aligned, unit age and control counts provide independent variance dimensions suitable for multivariate modeling.</w:t>
       </w:r>
     </w:p>
+    <w:p>
+      <w:pPr>
+        <w:spacing w:after="120" w:line="276" w:lineRule="auto"/>
+        <w:jc w:val="left"/>
+      </w:pPr>
+      <w:r>
+        <w:rPr>
+          <w:rFonts w:ascii="Times New Roman" w:hAnsi="Times New Roman"/>
+          <w:i w:val="0"/>
+          <w:sz w:val="22"/>
+        </w:rPr>
+        <w:t>Table 5 synthesizes the key empirical insights, operational interpretations, and analytical modeling decisions derived from the preceding exploratory visualizations and statistical distributions.</w:t>
+      </w:r>
+    </w:p>
     <w:tbl>
       <w:tblPr>
         <w:tblW w:type="auto" w:w="0"/>
@@ -7621,7 +8443,7 @@
           <w:b/>
           <w:sz w:val="22"/>
         </w:rPr>
-        <w:t>Table 4</w:t>
+        <w:t>Table 5</w:t>
       </w:r>
     </w:p>
     <w:p>
@@ -7863,7 +8685,7 @@
           <w:i w:val="0"/>
           <w:sz w:val="22"/>
         </w:rPr>
-        <w:t>Table 5 details the feature set utilized across the predictive and unsupervised modeling architectures, specifying original versus engineered derivation, data type, operational inclusion rationale, and model utilization.</w:t>
+        <w:t>Table 6 details the feature set utilized across the predictive and unsupervised modeling architectures, specifying original versus engineered derivation, data type, operational inclusion rationale, and model utilization.</w:t>
       </w:r>
     </w:p>
     <w:tbl>
@@ -8964,7 +9786,7 @@
           <w:b/>
           <w:sz w:val="22"/>
         </w:rPr>
-        <w:t>Table 5</w:t>
+        <w:t>Table 6</w:t>
       </w:r>
     </w:p>
     <w:p>
@@ -9028,7 +9850,7 @@
           <w:i w:val="0"/>
           <w:sz w:val="22"/>
         </w:rPr>
-        <w:t>Table 6 summarizes the formal mathematical evaluation metrics utilized across the inferential, predictive, and clustering models, including exact algebraic formulas, statistical interpretations, and specific capstone applications.</w:t>
+        <w:t>Table 7 summarizes the formal mathematical evaluation metrics utilized across the inferential, predictive, and clustering models, including exact algebraic formulas, statistical interpretations, and specific capstone applications.</w:t>
       </w:r>
     </w:p>
     <w:tbl>
@@ -10224,7 +11046,7 @@
           <w:b/>
           <w:sz w:val="22"/>
         </w:rPr>
-        <w:t>Table 6</w:t>
+        <w:t>Table 7</w:t>
       </w:r>
     </w:p>
     <w:p>
@@ -10647,7 +11469,7 @@
           <w:i w:val="0"/>
           <w:sz w:val="22"/>
         </w:rPr>
-        <w:t>As displayed in Figure 5 and Table 7, all three classifiers demonstrated exceptional discriminative accuracy, decisively rejecting the null hypothesis for RQ2. The Random Forest model achieved a test classification accuracy of 93.95%, an F1-score of 0.8858, a sensitivity (recall) of 93.14%, and an outstanding ROC-AUC of 0.9851. Out of 204 actual high emitters in the test set, Random Forest successfully identified 190 units, missing only 14 (Figure 6). Gradient Boosting achieved the highest overall test accuracy (96.54%) and precision (94.44%), with an F1-score of 0.9303 and ROC-AUC of 0.9865.</w:t>
+        <w:t>As displayed in Figure 5 and Table 8, all three classifiers demonstrated exceptional discriminative accuracy, decisively rejecting the null hypothesis for RQ2. The Random Forest model achieved a test classification accuracy of 93.95%, an F1-score of 0.8858, a sensitivity (recall) of 93.14%, and an outstanding ROC-AUC of 0.9851. Out of 204 actual high emitters in the test set, Random Forest successfully identified 190 units, missing only 14 (Figure 6). Gradient Boosting achieved the highest overall test accuracy (96.54%) and precision (94.44%), with an F1-score of 0.9303 and ROC-AUC of 0.9865.</w:t>
       </w:r>
     </w:p>
     <w:p>
@@ -11414,7 +12236,7 @@
           <w:b/>
           <w:sz w:val="22"/>
         </w:rPr>
-        <w:t>Table 7</w:t>
+        <w:t>Table 8</w:t>
       </w:r>
     </w:p>
     <w:p>
@@ -12745,7 +13567,7 @@
           <w:b/>
           <w:sz w:val="22"/>
         </w:rPr>
-        <w:t>Table 8</w:t>
+        <w:t>Table 9</w:t>
       </w:r>
     </w:p>
     <w:p>
@@ -12793,7 +13615,7 @@
           <w:i w:val="0"/>
           <w:sz w:val="22"/>
         </w:rPr>
-        <w:t>Table 8 illuminates the distinct regulatory profiles of the four clusters. Cluster 4 (Aging Heavy Coal Baseload) encompasses 414 generating units (10.2% of fleet) with an extraordinary high-emitter prevalence of 86.0%, mean unit age of 46.8 years, and average control count of 3.18. These units represent the acute locus of regulatory risk under CSAPR and MATS. In contrast, Cluster 1 comprises modern peaking gas turbines with 0.0% high-emitter classification, while Cluster 3 represents high-efficiency combined cycle natural gas facilities. This empirical segmentation provides regulatory agencies with an objective, data-driven framework for targeted surveillance and tiered audit resource allocation.</w:t>
+        <w:t>Table 9 illuminates the distinct regulatory profiles of the four clusters. Cluster 4 (Aging Heavy Coal Baseload) encompasses 414 generating units (10.2% of fleet) with an extraordinary high-emitter prevalence of 86.0%, mean unit age of 46.8 years, and average control count of 3.18. These units represent the acute locus of regulatory risk under CSAPR and MATS. In contrast, Cluster 1 comprises modern peaking gas turbines with 0.0% high-emitter classification, while Cluster 3 represents high-efficiency combined cycle natural gas facilities. This empirical segmentation provides regulatory agencies with an objective, data-driven framework for targeted surveillance and tiered audit resource allocation.</w:t>
       </w:r>
     </w:p>
     <w:p>

</xml_diff>

<commit_message>
Align GitHub Data Availability fields and Page 2 Repository Directory Architecture strictly with Templates
</commit_message>
<xml_diff>
--- a/reports/QM 640_Interim_Report_DhananjayVerma-0291493.docx
+++ b/reports/QM 640_Interim_Report_DhananjayVerma-0291493.docx
@@ -148,7 +148,7 @@
           <w:i w:val="0"/>
           <w:sz w:val="22"/>
         </w:rPr>
-        <w:t>To support scientific reproducibility, public auditability, and academic evaluation, all raw data artifacts, engineered datasets, Python modeling scripts, statistical pipelines, and visualization routines have been systematically curated and deposited in the official project repository:</w:t>
+        <w:t>To support scientific reproducibility, public auditability, and academic evaluation, all raw data artifacts, engineered datasets, executable Jupyter Notebook (.ipynb), Python modeling scripts, statistical pipelines, and visualization routines have been systematically curated and deposited in the official project repository:</w:t>
       </w:r>
     </w:p>
     <w:p>
@@ -184,7 +184,7 @@
           <w:b/>
           <w:sz w:val="22"/>
         </w:rPr>
-        <w:t xml:space="preserve">Raw Data URL: </w:t>
+        <w:t xml:space="preserve">Raw data: </w:t>
       </w:r>
       <w:r>
         <w:rPr>
@@ -206,7 +206,7 @@
           <w:b/>
           <w:sz w:val="22"/>
         </w:rPr>
-        <w:t xml:space="preserve">Processed Data URL: </w:t>
+        <w:t xml:space="preserve">Processed/clean data: </w:t>
       </w:r>
       <w:r>
         <w:rPr>
@@ -228,7 +228,7 @@
           <w:b/>
           <w:sz w:val="22"/>
         </w:rPr>
-        <w:t xml:space="preserve">Code/Notebooks: </w:t>
+        <w:t xml:space="preserve">Code/notebooks: </w:t>
       </w:r>
       <w:r>
         <w:rPr>
@@ -236,7 +236,7 @@
           <w:i w:val="0"/>
           <w:sz w:val="22"/>
         </w:rPr>
-        <w:t>https://github.com/djmsritai-tech/QM640-Data-Analytics-Capstone/tree/main/scripts</w:t>
+        <w:t>https://github.com/djmsritai-tech/QM640-Data-Analytics-Capstone/tree/main/scripts (and https://github.com/djmsritai-tech/QM640-Data-Analytics-Capstone/blob/main/QM640_Capstone_Analytics_Notebook_DhananjayVerma_0291493.ipynb)</w:t>
       </w:r>
     </w:p>
     <w:p>
@@ -258,7 +258,7 @@
           <w:i w:val="0"/>
           <w:sz w:val="22"/>
         </w:rPr>
-        <w:t>outputs/figures/ (10 APA 7 publication-grade figures at 300 DPI)</w:t>
+        <w:t>outputs/figures/ (11 APA 7 publication-grade figures at 300 DPI)</w:t>
       </w:r>
     </w:p>
     <w:p>
@@ -6285,7 +6285,7 @@
           <w:i w:val="0"/>
           <w:sz w:val="22"/>
         </w:rPr>
-        <w:t>In accordance with university capstone requirements, the complete raw and processed datasets, executable Jupyter Notebook (.ipynb), and Python scripts are permanently maintained and available in the GitHub repository under:</w:t>
+        <w:t>In accordance with university capstone requirements, the complete raw and processed datasets and Python notebooks/scripts are permanently maintained and available in the GitHub repository under:</w:t>
       </w:r>
     </w:p>
     <w:p>
@@ -6334,28 +6334,6 @@
     </w:p>
     <w:p>
       <w:pPr>
-        <w:spacing w:after="80" w:line="276" w:lineRule="auto"/>
-        <w:jc w:val="left"/>
-      </w:pPr>
-      <w:r>
-        <w:rPr>
-          <w:rFonts w:ascii="Times New Roman" w:hAnsi="Times New Roman"/>
-          <w:b/>
-          <w:sz w:val="22"/>
-        </w:rPr>
-        <w:t xml:space="preserve">Interactive Jupyter Notebook (.ipynb): </w:t>
-      </w:r>
-      <w:r>
-        <w:rPr>
-          <w:rFonts w:ascii="Times New Roman" w:hAnsi="Times New Roman"/>
-          <w:i w:val="0"/>
-          <w:sz w:val="22"/>
-        </w:rPr>
-        <w:t>https://github.com/djmsritai-tech/QM640-Data-Analytics-Capstone/blob/main/QM640_Capstone_Analytics_Notebook_DhananjayVerma_0291493.ipynb</w:t>
-      </w:r>
-    </w:p>
-    <w:p>
-      <w:pPr>
         <w:spacing w:after="200" w:line="276" w:lineRule="auto"/>
         <w:jc w:val="left"/>
       </w:pPr>
@@ -6365,7 +6343,7 @@
           <w:b/>
           <w:sz w:val="22"/>
         </w:rPr>
-        <w:t xml:space="preserve">Code/scripts: </w:t>
+        <w:t xml:space="preserve">Code/notebooks: </w:t>
       </w:r>
       <w:r>
         <w:rPr>
@@ -6373,7 +6351,7 @@
           <w:i w:val="0"/>
           <w:sz w:val="22"/>
         </w:rPr>
-        <w:t>https://github.com/djmsritai-tech/QM640-Data-Analytics-Capstone/tree/main/scripts</w:t>
+        <w:t>https://github.com/djmsritai-tech/QM640-Data-Analytics-Capstone/tree/main/scripts (and https://github.com/djmsritai-tech/QM640-Data-Analytics-Capstone/blob/main/QM640_Capstone_Analytics_Notebook_DhananjayVerma_0291493.ipynb)</w:t>
       </w:r>
     </w:p>
     <w:p>

</xml_diff>

<commit_message>
Place Minimum Sample Size Computation per RQ directly inside Section 4 (Analysis) of Interim Report
</commit_message>
<xml_diff>
--- a/reports/QM 640_Interim_Report_DhananjayVerma-0291493.docx
+++ b/reports/QM 640_Interim_Report_DhananjayVerma-0291493.docx
@@ -5463,814 +5463,6 @@
           <w:color w:val="19375F"/>
           <w:sz w:val="24"/>
         </w:rPr>
-        <w:t>Sample Size Justification &amp; Analytical Record Allocation across Models</w:t>
-      </w:r>
-    </w:p>
-    <w:p>
-      <w:pPr>
-        <w:spacing w:after="120" w:line="276" w:lineRule="auto"/>
-        <w:jc w:val="left"/>
-      </w:pPr>
-      <w:r>
-        <w:rPr>
-          <w:rFonts w:ascii="Times New Roman" w:hAnsi="Times New Roman"/>
-          <w:i w:val="0"/>
-          <w:sz w:val="22"/>
-        </w:rPr>
-        <w:t>A foundational methodological strength of this capstone research is that modeling and statistical inferences were conducted on the complete national fleet of 4,050 generating units across 1,328 unique facilities, representing 100% of regulated units in facility-2025.csv with zero records discarded. In accordance with the sampling methodology established in the capstone synopsis, statistical power calculations (Cohen, 1988; Cochran, 1977) confirm that the 4,050 records exceed the minimum sample size requirements for each analytical model by an order of magnitude.</w:t>
-      </w:r>
-    </w:p>
-    <w:p>
-      <w:pPr>
-        <w:spacing w:after="120" w:line="276" w:lineRule="auto"/>
-        <w:jc w:val="left"/>
-      </w:pPr>
-      <w:r>
-        <w:rPr>
-          <w:rFonts w:ascii="Times New Roman" w:hAnsi="Times New Roman"/>
-          <w:i w:val="0"/>
-          <w:sz w:val="22"/>
-        </w:rPr>
-        <w:t>For RQ1, group comparisons across fuel categories require a minimum of 30 observations per group (rule of thumb) and an aggregate sample of 159–180 units for medium effect size (f = 0.25, power = 80%, α = 0.05); the available 4,050 units exceed this threshold by over 22-fold. For RQ2, predictive classification guidelines dictate 10–20 observations per candidate predictor per class (minimum 120–240 units for 6–12 predictors); our stratified partitioning allocates 3,240 records (80%) to the training set with 5-fold cross-validation and preserves 810 records (20%) as a holdout test set (containing 204 actual high emitters and 606 low emitters), ensuring exceptional model stability and preventing data leakage. For RQ3, linear and multivariate regressions require 300–800 records for small-to-medium effect detection; all 4,050 units are utilized (degrees of freedom = 4,046). For RQ4, unsupervised clustering heuristics require at least 10× the feature count (≥ 300 units); K-Means is executed across the entire 4,050-unit fleet. Table 3 details the exact record allocation across all models.</w:t>
-      </w:r>
-    </w:p>
-    <w:p>
-      <w:pPr>
-        <w:keepNext/>
-        <w:spacing w:before="240" w:after="40"/>
-      </w:pPr>
-      <w:r>
-        <w:rPr>
-          <w:rFonts w:ascii="Times New Roman" w:hAnsi="Times New Roman"/>
-          <w:b/>
-          <w:sz w:val="22"/>
-        </w:rPr>
-        <w:t>Table 3</w:t>
-      </w:r>
-    </w:p>
-    <w:p>
-      <w:pPr>
-        <w:keepNext/>
-        <w:spacing w:before="0" w:after="120"/>
-      </w:pPr>
-      <w:r>
-        <w:rPr>
-          <w:rFonts w:ascii="Times New Roman" w:hAnsi="Times New Roman"/>
-          <w:i/>
-          <w:sz w:val="22"/>
-        </w:rPr>
-        <w:t>Analytical Model Record Allocation and Sample Size Justification</w:t>
-      </w:r>
-    </w:p>
-    <w:tbl>
-      <w:tblPr>
-        <w:tblW w:type="auto" w:w="0"/>
-        <w:tblLook w:firstColumn="1" w:firstRow="1" w:lastColumn="0" w:lastRow="0" w:noHBand="0" w:noVBand="1" w:val="04A0"/>
-        <w:jc w:val="center"/>
-        <w:tblBorders>
-          <w:top w:val="single" w:sz="12" w:space="0" w:color="000000"/>
-          <w:bottom w:val="single" w:sz="12" w:space="0" w:color="000000"/>
-          <w:insideH w:val="single" w:sz="4" w:space="0" w:color="E5E5E5"/>
-          <w:insideV w:val="none"/>
-          <w:left w:val="none"/>
-          <w:right w:val="none"/>
-        </w:tblBorders>
-      </w:tblPr>
-      <w:tblGrid>
-        <w:gridCol w:w="1337"/>
-        <w:gridCol w:w="1337"/>
-        <w:gridCol w:w="1337"/>
-        <w:gridCol w:w="1337"/>
-        <w:gridCol w:w="1337"/>
-        <w:gridCol w:w="1337"/>
-        <w:gridCol w:w="1337"/>
-      </w:tblGrid>
-      <w:tr>
-        <w:trPr>
-          <w:tblHeader/>
-        </w:trPr>
-        <w:tc>
-          <w:tcPr>
-            <w:tcW w:type="dxa" w:w="1728"/>
-            <w:tcBorders>
-              <w:bottom w:val="single" w:sz="12" w:space="0" w:color="000000"/>
-            </w:tcBorders>
-            <w:shd w:fill="F4F6F8"/>
-          </w:tcPr>
-          <w:p>
-            <w:pPr>
-              <w:spacing w:before="60" w:after="60" w:line="240" w:lineRule="auto"/>
-              <w:jc w:val="center"/>
-            </w:pPr>
-            <w:r>
-              <w:rPr>
-                <w:rFonts w:ascii="Times New Roman" w:hAnsi="Times New Roman"/>
-                <w:b/>
-                <w:sz w:val="19"/>
-              </w:rPr>
-              <w:t>Research Question &amp; Scope</w:t>
-            </w:r>
-          </w:p>
-        </w:tc>
-        <w:tc>
-          <w:tcPr>
-            <w:tcW w:type="dxa" w:w="1584"/>
-            <w:tcBorders>
-              <w:bottom w:val="single" w:sz="12" w:space="0" w:color="000000"/>
-            </w:tcBorders>
-            <w:shd w:fill="F4F6F8"/>
-          </w:tcPr>
-          <w:p>
-            <w:pPr>
-              <w:spacing w:before="60" w:after="60" w:line="240" w:lineRule="auto"/>
-              <w:jc w:val="center"/>
-            </w:pPr>
-            <w:r>
-              <w:rPr>
-                <w:rFonts w:ascii="Times New Roman" w:hAnsi="Times New Roman"/>
-                <w:b/>
-                <w:sz w:val="19"/>
-              </w:rPr>
-              <w:t>Analytical Model</w:t>
-            </w:r>
-          </w:p>
-        </w:tc>
-        <w:tc>
-          <w:tcPr>
-            <w:tcW w:type="dxa" w:w="1152"/>
-            <w:tcBorders>
-              <w:bottom w:val="single" w:sz="12" w:space="0" w:color="000000"/>
-            </w:tcBorders>
-            <w:shd w:fill="F4F6F8"/>
-          </w:tcPr>
-          <w:p>
-            <w:pPr>
-              <w:spacing w:before="60" w:after="60" w:line="240" w:lineRule="auto"/>
-              <w:jc w:val="center"/>
-            </w:pPr>
-            <w:r>
-              <w:rPr>
-                <w:rFonts w:ascii="Times New Roman" w:hAnsi="Times New Roman"/>
-                <w:b/>
-                <w:sz w:val="19"/>
-              </w:rPr>
-              <w:t>Total Records</w:t>
-            </w:r>
-          </w:p>
-        </w:tc>
-        <w:tc>
-          <w:tcPr>
-            <w:tcW w:type="dxa" w:w="1296"/>
-            <w:tcBorders>
-              <w:bottom w:val="single" w:sz="12" w:space="0" w:color="000000"/>
-            </w:tcBorders>
-            <w:shd w:fill="F4F6F8"/>
-          </w:tcPr>
-          <w:p>
-            <w:pPr>
-              <w:spacing w:before="60" w:after="60" w:line="240" w:lineRule="auto"/>
-              <w:jc w:val="center"/>
-            </w:pPr>
-            <w:r>
-              <w:rPr>
-                <w:rFonts w:ascii="Times New Roman" w:hAnsi="Times New Roman"/>
-                <w:b/>
-                <w:sz w:val="19"/>
-              </w:rPr>
-              <w:t>Training Set</w:t>
-            </w:r>
-          </w:p>
-        </w:tc>
-        <w:tc>
-          <w:tcPr>
-            <w:tcW w:type="dxa" w:w="1584"/>
-            <w:tcBorders>
-              <w:bottom w:val="single" w:sz="12" w:space="0" w:color="000000"/>
-            </w:tcBorders>
-            <w:shd w:fill="F4F6F8"/>
-          </w:tcPr>
-          <w:p>
-            <w:pPr>
-              <w:spacing w:before="60" w:after="60" w:line="240" w:lineRule="auto"/>
-              <w:jc w:val="center"/>
-            </w:pPr>
-            <w:r>
-              <w:rPr>
-                <w:rFonts w:ascii="Times New Roman" w:hAnsi="Times New Roman"/>
-                <w:b/>
-                <w:sz w:val="19"/>
-              </w:rPr>
-              <w:t>Validation / Holdout</w:t>
-            </w:r>
-          </w:p>
-        </w:tc>
-        <w:tc>
-          <w:tcPr>
-            <w:tcW w:type="dxa" w:w="1440"/>
-            <w:tcBorders>
-              <w:bottom w:val="single" w:sz="12" w:space="0" w:color="000000"/>
-            </w:tcBorders>
-            <w:shd w:fill="F4F6F8"/>
-          </w:tcPr>
-          <w:p>
-            <w:pPr>
-              <w:spacing w:before="60" w:after="60" w:line="240" w:lineRule="auto"/>
-              <w:jc w:val="center"/>
-            </w:pPr>
-            <w:r>
-              <w:rPr>
-                <w:rFonts w:ascii="Times New Roman" w:hAnsi="Times New Roman"/>
-                <w:b/>
-                <w:sz w:val="19"/>
-              </w:rPr>
-              <w:t>Minimum Needed (Power)</w:t>
-            </w:r>
-          </w:p>
-        </w:tc>
-        <w:tc>
-          <w:tcPr>
-            <w:tcW w:type="dxa" w:w="1584"/>
-            <w:tcBorders>
-              <w:bottom w:val="single" w:sz="12" w:space="0" w:color="000000"/>
-            </w:tcBorders>
-            <w:shd w:fill="F4F6F8"/>
-          </w:tcPr>
-          <w:p>
-            <w:pPr>
-              <w:spacing w:before="60" w:after="60" w:line="240" w:lineRule="auto"/>
-              <w:jc w:val="center"/>
-            </w:pPr>
-            <w:r>
-              <w:rPr>
-                <w:rFonts w:ascii="Times New Roman" w:hAnsi="Times New Roman"/>
-                <w:b/>
-                <w:sz w:val="19"/>
-              </w:rPr>
-              <w:t>Statistical Power Evaluation</w:t>
-            </w:r>
-          </w:p>
-        </w:tc>
-      </w:tr>
-      <w:tr>
-        <w:tc>
-          <w:tcPr>
-            <w:tcW w:type="dxa" w:w="1728"/>
-          </w:tcPr>
-          <w:p>
-            <w:pPr>
-              <w:spacing w:before="40" w:after="40" w:line="252" w:lineRule="auto"/>
-              <w:jc w:val="left"/>
-            </w:pPr>
-            <w:r>
-              <w:rPr>
-                <w:rFonts w:ascii="Times New Roman" w:hAnsi="Times New Roman"/>
-                <w:sz w:val="18"/>
-              </w:rPr>
-              <w:t>RQ1: Emission &amp; Heat Input Variability across Fuel Types</w:t>
-            </w:r>
-          </w:p>
-        </w:tc>
-        <w:tc>
-          <w:tcPr>
-            <w:tcW w:type="dxa" w:w="1584"/>
-          </w:tcPr>
-          <w:p>
-            <w:pPr>
-              <w:spacing w:before="40" w:after="40" w:line="252" w:lineRule="auto"/>
-              <w:jc w:val="left"/>
-            </w:pPr>
-            <w:r>
-              <w:rPr>
-                <w:rFonts w:ascii="Times New Roman" w:hAnsi="Times New Roman"/>
-                <w:sz w:val="18"/>
-              </w:rPr>
-              <w:t>One-Way ANOVA &amp; Kruskal-Wallis Test</w:t>
-            </w:r>
-          </w:p>
-        </w:tc>
-        <w:tc>
-          <w:tcPr>
-            <w:tcW w:type="dxa" w:w="1152"/>
-          </w:tcPr>
-          <w:p>
-            <w:pPr>
-              <w:spacing w:before="40" w:after="40" w:line="252" w:lineRule="auto"/>
-              <w:jc w:val="left"/>
-            </w:pPr>
-            <w:r>
-              <w:rPr>
-                <w:rFonts w:ascii="Times New Roman" w:hAnsi="Times New Roman"/>
-                <w:sz w:val="18"/>
-              </w:rPr>
-              <w:t>4,050 records (100%)</w:t>
-            </w:r>
-          </w:p>
-        </w:tc>
-        <w:tc>
-          <w:tcPr>
-            <w:tcW w:type="dxa" w:w="1296"/>
-          </w:tcPr>
-          <w:p>
-            <w:pPr>
-              <w:spacing w:before="40" w:after="40" w:line="252" w:lineRule="auto"/>
-              <w:jc w:val="left"/>
-            </w:pPr>
-            <w:r>
-              <w:rPr>
-                <w:rFonts w:ascii="Times New Roman" w:hAnsi="Times New Roman"/>
-                <w:sz w:val="18"/>
-              </w:rPr>
-              <w:t>4,050 records (Full population)</w:t>
-            </w:r>
-          </w:p>
-        </w:tc>
-        <w:tc>
-          <w:tcPr>
-            <w:tcW w:type="dxa" w:w="1584"/>
-          </w:tcPr>
-          <w:p>
-            <w:pPr>
-              <w:spacing w:before="40" w:after="40" w:line="252" w:lineRule="auto"/>
-              <w:jc w:val="left"/>
-            </w:pPr>
-            <w:r>
-              <w:rPr>
-                <w:rFonts w:ascii="Times New Roman" w:hAnsi="Times New Roman"/>
-                <w:sz w:val="18"/>
-              </w:rPr>
-              <w:t>N/A (Omnibus inference)</w:t>
-            </w:r>
-          </w:p>
-        </w:tc>
-        <w:tc>
-          <w:tcPr>
-            <w:tcW w:type="dxa" w:w="1440"/>
-          </w:tcPr>
-          <w:p>
-            <w:pPr>
-              <w:spacing w:before="40" w:after="40" w:line="252" w:lineRule="auto"/>
-              <w:jc w:val="left"/>
-            </w:pPr>
-            <w:r>
-              <w:rPr>
-                <w:rFonts w:ascii="Times New Roman" w:hAnsi="Times New Roman"/>
-                <w:sz w:val="18"/>
-              </w:rPr>
-              <w:t>159–180 units (f = 0.25, power = 80%)</w:t>
-            </w:r>
-          </w:p>
-        </w:tc>
-        <w:tc>
-          <w:tcPr>
-            <w:tcW w:type="dxa" w:w="1584"/>
-          </w:tcPr>
-          <w:p>
-            <w:pPr>
-              <w:spacing w:before="40" w:after="40" w:line="252" w:lineRule="auto"/>
-              <w:jc w:val="left"/>
-            </w:pPr>
-            <w:r>
-              <w:rPr>
-                <w:rFonts w:ascii="Times New Roman" w:hAnsi="Times New Roman"/>
-                <w:sz w:val="18"/>
-              </w:rPr>
-              <w:t>Exceeds minimum by &gt;22×; highly robust to non-normality.</w:t>
-            </w:r>
-          </w:p>
-        </w:tc>
-      </w:tr>
-      <w:tr>
-        <w:tc>
-          <w:tcPr>
-            <w:tcW w:type="dxa" w:w="1728"/>
-            <w:shd w:fill="FAFAFA"/>
-          </w:tcPr>
-          <w:p>
-            <w:pPr>
-              <w:spacing w:before="40" w:after="40" w:line="252" w:lineRule="auto"/>
-              <w:jc w:val="left"/>
-            </w:pPr>
-            <w:r>
-              <w:rPr>
-                <w:rFonts w:ascii="Times New Roman" w:hAnsi="Times New Roman"/>
-                <w:sz w:val="18"/>
-              </w:rPr>
-              <w:t>RQ2: Predictive Classification of High-Emission Units</w:t>
-            </w:r>
-          </w:p>
-        </w:tc>
-        <w:tc>
-          <w:tcPr>
-            <w:tcW w:type="dxa" w:w="1584"/>
-            <w:shd w:fill="FAFAFA"/>
-          </w:tcPr>
-          <w:p>
-            <w:pPr>
-              <w:spacing w:before="40" w:after="40" w:line="252" w:lineRule="auto"/>
-              <w:jc w:val="left"/>
-            </w:pPr>
-            <w:r>
-              <w:rPr>
-                <w:rFonts w:ascii="Times New Roman" w:hAnsi="Times New Roman"/>
-                <w:sz w:val="18"/>
-              </w:rPr>
-              <w:t>Random Forest, Gradient Boosting, Logistic Regression</w:t>
-            </w:r>
-          </w:p>
-        </w:tc>
-        <w:tc>
-          <w:tcPr>
-            <w:tcW w:type="dxa" w:w="1152"/>
-            <w:shd w:fill="FAFAFA"/>
-          </w:tcPr>
-          <w:p>
-            <w:pPr>
-              <w:spacing w:before="40" w:after="40" w:line="252" w:lineRule="auto"/>
-              <w:jc w:val="left"/>
-            </w:pPr>
-            <w:r>
-              <w:rPr>
-                <w:rFonts w:ascii="Times New Roman" w:hAnsi="Times New Roman"/>
-                <w:sz w:val="18"/>
-              </w:rPr>
-              <w:t>4,050 records (100%)</w:t>
-            </w:r>
-          </w:p>
-        </w:tc>
-        <w:tc>
-          <w:tcPr>
-            <w:tcW w:type="dxa" w:w="1296"/>
-            <w:shd w:fill="FAFAFA"/>
-          </w:tcPr>
-          <w:p>
-            <w:pPr>
-              <w:spacing w:before="40" w:after="40" w:line="252" w:lineRule="auto"/>
-              <w:jc w:val="left"/>
-            </w:pPr>
-            <w:r>
-              <w:rPr>
-                <w:rFonts w:ascii="Times New Roman" w:hAnsi="Times New Roman"/>
-                <w:sz w:val="18"/>
-              </w:rPr>
-              <w:t>3,240 records (80% stratified)</w:t>
-            </w:r>
-          </w:p>
-        </w:tc>
-        <w:tc>
-          <w:tcPr>
-            <w:tcW w:type="dxa" w:w="1584"/>
-            <w:shd w:fill="FAFAFA"/>
-          </w:tcPr>
-          <w:p>
-            <w:pPr>
-              <w:spacing w:before="40" w:after="40" w:line="252" w:lineRule="auto"/>
-              <w:jc w:val="left"/>
-            </w:pPr>
-            <w:r>
-              <w:rPr>
-                <w:rFonts w:ascii="Times New Roman" w:hAnsi="Times New Roman"/>
-                <w:sz w:val="18"/>
-              </w:rPr>
-              <w:t>810 records (20% holdout: 204 High / 606 Low)</w:t>
-            </w:r>
-          </w:p>
-        </w:tc>
-        <w:tc>
-          <w:tcPr>
-            <w:tcW w:type="dxa" w:w="1440"/>
-            <w:shd w:fill="FAFAFA"/>
-          </w:tcPr>
-          <w:p>
-            <w:pPr>
-              <w:spacing w:before="40" w:after="40" w:line="252" w:lineRule="auto"/>
-              <w:jc w:val="left"/>
-            </w:pPr>
-            <w:r>
-              <w:rPr>
-                <w:rFonts w:ascii="Times New Roman" w:hAnsi="Times New Roman"/>
-                <w:sz w:val="18"/>
-              </w:rPr>
-              <w:t>120–240 units (10–20 per predictor/class)</w:t>
-            </w:r>
-          </w:p>
-        </w:tc>
-        <w:tc>
-          <w:tcPr>
-            <w:tcW w:type="dxa" w:w="1584"/>
-            <w:shd w:fill="FAFAFA"/>
-          </w:tcPr>
-          <w:p>
-            <w:pPr>
-              <w:spacing w:before="40" w:after="40" w:line="252" w:lineRule="auto"/>
-              <w:jc w:val="left"/>
-            </w:pPr>
-            <w:r>
-              <w:rPr>
-                <w:rFonts w:ascii="Times New Roman" w:hAnsi="Times New Roman"/>
-                <w:sz w:val="18"/>
-              </w:rPr>
-              <w:t>Exceeds minimum by &gt;13×; 5-fold CV ensures generalizability without leakage.</w:t>
-            </w:r>
-          </w:p>
-        </w:tc>
-      </w:tr>
-      <w:tr>
-        <w:tc>
-          <w:tcPr>
-            <w:tcW w:type="dxa" w:w="1728"/>
-          </w:tcPr>
-          <w:p>
-            <w:pPr>
-              <w:spacing w:before="40" w:after="40" w:line="252" w:lineRule="auto"/>
-              <w:jc w:val="left"/>
-            </w:pPr>
-            <w:r>
-              <w:rPr>
-                <w:rFonts w:ascii="Times New Roman" w:hAnsi="Times New Roman"/>
-                <w:sz w:val="18"/>
-              </w:rPr>
-              <w:t>RQ3: Unit Age and Operational Thermal Intensity</w:t>
-            </w:r>
-          </w:p>
-        </w:tc>
-        <w:tc>
-          <w:tcPr>
-            <w:tcW w:type="dxa" w:w="1584"/>
-          </w:tcPr>
-          <w:p>
-            <w:pPr>
-              <w:spacing w:before="40" w:after="40" w:line="252" w:lineRule="auto"/>
-              <w:jc w:val="left"/>
-            </w:pPr>
-            <w:r>
-              <w:rPr>
-                <w:rFonts w:ascii="Times New Roman" w:hAnsi="Times New Roman"/>
-                <w:sz w:val="18"/>
-              </w:rPr>
-              <w:t>Bivariate &amp; Multivariate OLS Regressions</w:t>
-            </w:r>
-          </w:p>
-        </w:tc>
-        <w:tc>
-          <w:tcPr>
-            <w:tcW w:type="dxa" w:w="1152"/>
-          </w:tcPr>
-          <w:p>
-            <w:pPr>
-              <w:spacing w:before="40" w:after="40" w:line="252" w:lineRule="auto"/>
-              <w:jc w:val="left"/>
-            </w:pPr>
-            <w:r>
-              <w:rPr>
-                <w:rFonts w:ascii="Times New Roman" w:hAnsi="Times New Roman"/>
-                <w:sz w:val="18"/>
-              </w:rPr>
-              <w:t>4,050 records (100%)</w:t>
-            </w:r>
-          </w:p>
-        </w:tc>
-        <w:tc>
-          <w:tcPr>
-            <w:tcW w:type="dxa" w:w="1296"/>
-          </w:tcPr>
-          <w:p>
-            <w:pPr>
-              <w:spacing w:before="40" w:after="40" w:line="252" w:lineRule="auto"/>
-              <w:jc w:val="left"/>
-            </w:pPr>
-            <w:r>
-              <w:rPr>
-                <w:rFonts w:ascii="Times New Roman" w:hAnsi="Times New Roman"/>
-                <w:sz w:val="18"/>
-              </w:rPr>
-              <w:t>4,050 records (Full population)</w:t>
-            </w:r>
-          </w:p>
-        </w:tc>
-        <w:tc>
-          <w:tcPr>
-            <w:tcW w:type="dxa" w:w="1584"/>
-          </w:tcPr>
-          <w:p>
-            <w:pPr>
-              <w:spacing w:before="40" w:after="40" w:line="252" w:lineRule="auto"/>
-              <w:jc w:val="left"/>
-            </w:pPr>
-            <w:r>
-              <w:rPr>
-                <w:rFonts w:ascii="Times New Roman" w:hAnsi="Times New Roman"/>
-                <w:sz w:val="18"/>
-              </w:rPr>
-              <w:t>N/A (df = 4,046; residual diagnostics)</w:t>
-            </w:r>
-          </w:p>
-        </w:tc>
-        <w:tc>
-          <w:tcPr>
-            <w:tcW w:type="dxa" w:w="1440"/>
-          </w:tcPr>
-          <w:p>
-            <w:pPr>
-              <w:spacing w:before="40" w:after="40" w:line="252" w:lineRule="auto"/>
-              <w:jc w:val="left"/>
-            </w:pPr>
-            <w:r>
-              <w:rPr>
-                <w:rFonts w:ascii="Times New Roman" w:hAnsi="Times New Roman"/>
-                <w:sz w:val="18"/>
-              </w:rPr>
-              <w:t>300–800 units (Small-medium effect, r ≈ 0.1-0.3)</w:t>
-            </w:r>
-          </w:p>
-        </w:tc>
-        <w:tc>
-          <w:tcPr>
-            <w:tcW w:type="dxa" w:w="1584"/>
-          </w:tcPr>
-          <w:p>
-            <w:pPr>
-              <w:spacing w:before="40" w:after="40" w:line="252" w:lineRule="auto"/>
-              <w:jc w:val="left"/>
-            </w:pPr>
-            <w:r>
-              <w:rPr>
-                <w:rFonts w:ascii="Times New Roman" w:hAnsi="Times New Roman"/>
-                <w:sz w:val="18"/>
-              </w:rPr>
-              <w:t>Exceeds minimum by &gt;5×; highly stable parameter standard errors.</w:t>
-            </w:r>
-          </w:p>
-        </w:tc>
-      </w:tr>
-      <w:tr>
-        <w:tc>
-          <w:tcPr>
-            <w:tcW w:type="dxa" w:w="1728"/>
-            <w:shd w:fill="FAFAFA"/>
-          </w:tcPr>
-          <w:p>
-            <w:pPr>
-              <w:spacing w:before="40" w:after="40" w:line="252" w:lineRule="auto"/>
-              <w:jc w:val="left"/>
-            </w:pPr>
-            <w:r>
-              <w:rPr>
-                <w:rFonts w:ascii="Times New Roman" w:hAnsi="Times New Roman"/>
-                <w:sz w:val="18"/>
-              </w:rPr>
-              <w:t>RQ4: Unsupervised Fleet Segmentation &amp; Archetype Profiling</w:t>
-            </w:r>
-          </w:p>
-        </w:tc>
-        <w:tc>
-          <w:tcPr>
-            <w:tcW w:type="dxa" w:w="1584"/>
-            <w:shd w:fill="FAFAFA"/>
-          </w:tcPr>
-          <w:p>
-            <w:pPr>
-              <w:spacing w:before="40" w:after="40" w:line="252" w:lineRule="auto"/>
-              <w:jc w:val="left"/>
-            </w:pPr>
-            <w:r>
-              <w:rPr>
-                <w:rFonts w:ascii="Times New Roman" w:hAnsi="Times New Roman"/>
-                <w:sz w:val="18"/>
-              </w:rPr>
-              <w:t>K-Means Clustering &amp; 2D Principal Component Analysis</w:t>
-            </w:r>
-          </w:p>
-        </w:tc>
-        <w:tc>
-          <w:tcPr>
-            <w:tcW w:type="dxa" w:w="1152"/>
-            <w:shd w:fill="FAFAFA"/>
-          </w:tcPr>
-          <w:p>
-            <w:pPr>
-              <w:spacing w:before="40" w:after="40" w:line="252" w:lineRule="auto"/>
-              <w:jc w:val="left"/>
-            </w:pPr>
-            <w:r>
-              <w:rPr>
-                <w:rFonts w:ascii="Times New Roman" w:hAnsi="Times New Roman"/>
-                <w:sz w:val="18"/>
-              </w:rPr>
-              <w:t>4,050 records (100%)</w:t>
-            </w:r>
-          </w:p>
-        </w:tc>
-        <w:tc>
-          <w:tcPr>
-            <w:tcW w:type="dxa" w:w="1296"/>
-            <w:shd w:fill="FAFAFA"/>
-          </w:tcPr>
-          <w:p>
-            <w:pPr>
-              <w:spacing w:before="40" w:after="40" w:line="252" w:lineRule="auto"/>
-              <w:jc w:val="left"/>
-            </w:pPr>
-            <w:r>
-              <w:rPr>
-                <w:rFonts w:ascii="Times New Roman" w:hAnsi="Times New Roman"/>
-                <w:sz w:val="18"/>
-              </w:rPr>
-              <w:t>4,050 records (Full population)</w:t>
-            </w:r>
-          </w:p>
-        </w:tc>
-        <w:tc>
-          <w:tcPr>
-            <w:tcW w:type="dxa" w:w="1584"/>
-            <w:shd w:fill="FAFAFA"/>
-          </w:tcPr>
-          <w:p>
-            <w:pPr>
-              <w:spacing w:before="40" w:after="40" w:line="252" w:lineRule="auto"/>
-              <w:jc w:val="left"/>
-            </w:pPr>
-            <w:r>
-              <w:rPr>
-                <w:rFonts w:ascii="Times New Roman" w:hAnsi="Times New Roman"/>
-                <w:sz w:val="18"/>
-              </w:rPr>
-              <w:t>N/A (Fleet-wide centroid optimization)</w:t>
-            </w:r>
-          </w:p>
-        </w:tc>
-        <w:tc>
-          <w:tcPr>
-            <w:tcW w:type="dxa" w:w="1440"/>
-            <w:shd w:fill="FAFAFA"/>
-          </w:tcPr>
-          <w:p>
-            <w:pPr>
-              <w:spacing w:before="40" w:after="40" w:line="252" w:lineRule="auto"/>
-              <w:jc w:val="left"/>
-            </w:pPr>
-            <w:r>
-              <w:rPr>
-                <w:rFonts w:ascii="Times New Roman" w:hAnsi="Times New Roman"/>
-                <w:sz w:val="18"/>
-              </w:rPr>
-              <w:t>≥ 300 units (≥ 10× feature count rule)</w:t>
-            </w:r>
-          </w:p>
-        </w:tc>
-        <w:tc>
-          <w:tcPr>
-            <w:tcW w:type="dxa" w:w="1584"/>
-            <w:shd w:fill="FAFAFA"/>
-          </w:tcPr>
-          <w:p>
-            <w:pPr>
-              <w:spacing w:before="40" w:after="40" w:line="252" w:lineRule="auto"/>
-              <w:jc w:val="left"/>
-            </w:pPr>
-            <w:r>
-              <w:rPr>
-                <w:rFonts w:ascii="Times New Roman" w:hAnsi="Times New Roman"/>
-                <w:sz w:val="18"/>
-              </w:rPr>
-              <w:t>Exceeds minimum by &gt;13×; stable centroid formation and silhouette.</w:t>
-            </w:r>
-          </w:p>
-        </w:tc>
-      </w:tr>
-    </w:tbl>
-    <w:p>
-      <w:pPr>
-        <w:spacing w:before="60" w:after="240"/>
-      </w:pPr>
-      <w:r>
-        <w:rPr>
-          <w:rFonts w:ascii="Times New Roman" w:hAnsi="Times New Roman"/>
-          <w:i/>
-          <w:sz w:val="18"/>
-        </w:rPr>
-        <w:t xml:space="preserve">Note. </w:t>
-      </w:r>
-      <w:r>
-        <w:rPr>
-          <w:rFonts w:ascii="Times New Roman" w:hAnsi="Times New Roman"/>
-          <w:sz w:val="18"/>
-        </w:rPr>
-        <w:t>Comprehensive allocation of records across models confirming 100% data preservation (zero records discarded) and statistical power adequacy.</w:t>
-      </w:r>
-    </w:p>
-    <w:p>
-      <w:pPr>
-        <w:keepNext/>
-        <w:spacing w:before="240" w:after="120"/>
-        <w:jc w:val="left"/>
-      </w:pPr>
-      <w:r>
-        <w:rPr>
-          <w:rFonts w:ascii="Times New Roman" w:hAnsi="Times New Roman"/>
-          <w:b/>
-          <w:color w:val="19375F"/>
-          <w:sz w:val="24"/>
-        </w:rPr>
         <w:t>GitHub Data Availability Statement</w:t>
       </w:r>
     </w:p>
@@ -6529,7 +5721,7 @@
           <w:i w:val="0"/>
           <w:sz w:val="22"/>
         </w:rPr>
-        <w:t>Rigorous data cleaning and preprocessing protocols were instituted to resolve data quality anomalies, structural formatting irregularities, and missing values inherent in regulatory filings. Table 4 enumerates the complete data cleaning log, specifying the anomaly detected, variables impacted, detection methodology, corrective treatment applied, and theoretical rationale.</w:t>
+        <w:t>Rigorous data cleaning and preprocessing protocols were instituted to resolve data quality anomalies, structural formatting irregularities, and missing values inherent in regulatory filings. Table 3 enumerates the complete data cleaning log, specifying the anomaly detected, variables impacted, detection methodology, corrective treatment applied, and theoretical rationale.</w:t>
       </w:r>
     </w:p>
     <w:p>
@@ -6543,7 +5735,7 @@
           <w:b/>
           <w:sz w:val="22"/>
         </w:rPr>
-        <w:t>Table 4</w:t>
+        <w:t>Table 3</w:t>
       </w:r>
     </w:p>
     <w:p>
@@ -7491,7 +6683,7 @@
           <w:color w:val="19375F"/>
           <w:sz w:val="24"/>
         </w:rPr>
-        <w:t>Exploratory Data Analysis (EDA) Results and Interpretations</w:t>
+        <w:t>Minimum Sample Size Computation per Research Question (RQ1–RQ4)</w:t>
       </w:r>
     </w:p>
     <w:p>
@@ -7505,7 +6697,889 @@
           <w:i w:val="0"/>
           <w:sz w:val="22"/>
         </w:rPr>
-        <w:t>Exploratory data analysis was conducted to uncover fundamental empirical patterns, distributional properties, and inter-variable dependencies across the U.S. generating fleet. Emphasis is placed on the direct operational and regulatory interpretation of figures and tables, each of which is explicitly referenced and synthesized in the text.</w:t>
+        <w:t>A foundational methodological strength of this capstone research is that modeling and statistical inferences were conducted on the complete national fleet of 4,050 generating units across 1,328 unique facilities, representing 100% of regulated units in facility-2025.csv with zero records discarded. In accordance with statistical power theory (Cohen, 1988; Cochran, 1977), a priori minimum sample size computations were performed for each Research Question (RQ1–RQ4) at a significance level of α = 0.05 and target statistical power of 1 - β = 0.80 (80%):</w:t>
+      </w:r>
+    </w:p>
+    <w:p>
+      <w:pPr>
+        <w:spacing w:after="80" w:line="276" w:lineRule="auto"/>
+        <w:jc w:val="left"/>
+      </w:pPr>
+      <w:r>
+        <w:rPr>
+          <w:rFonts w:ascii="Times New Roman" w:hAnsi="Times New Roman"/>
+          <w:b/>
+          <w:sz w:val="22"/>
+        </w:rPr>
+        <w:t xml:space="preserve">RQ1 Minimum Sample Size Computation: </w:t>
+      </w:r>
+      <w:r>
+        <w:rPr>
+          <w:rFonts w:ascii="Times New Roman" w:hAnsi="Times New Roman"/>
+          <w:i w:val="0"/>
+          <w:sz w:val="22"/>
+        </w:rPr>
+        <w:t>For One-Way ANOVA and Kruskal-Wallis testing across k = 5 primary fuel categories, detecting a medium effect size (Cohen's f = 0.25, equivalent to η² ≈ 0.0588) at α = 0.05 and 80% power requires a minimum total sample of N_min = 159 to 196 units (and at least 30 units per major comparison group under the Central Limit Theorem). Our analyzed sample of N = 4,050 units exceeds this minimum requirement by more than 20-fold, yielding achieved statistical power &gt; 99.99%.</w:t>
+      </w:r>
+    </w:p>
+    <w:p>
+      <w:pPr>
+        <w:spacing w:after="80" w:line="276" w:lineRule="auto"/>
+        <w:jc w:val="left"/>
+      </w:pPr>
+      <w:r>
+        <w:rPr>
+          <w:rFonts w:ascii="Times New Roman" w:hAnsi="Times New Roman"/>
+          <w:b/>
+          <w:sz w:val="22"/>
+        </w:rPr>
+        <w:t xml:space="preserve">RQ2 Minimum Sample Size Computation: </w:t>
+      </w:r>
+      <w:r>
+        <w:rPr>
+          <w:rFonts w:ascii="Times New Roman" w:hAnsi="Times New Roman"/>
+          <w:i w:val="0"/>
+          <w:sz w:val="22"/>
+        </w:rPr>
+        <w:t>For binary classification of High_Emitter status (25.14% positive prevalence, 1,018 high emitters across 4,050 units), standard events-per-variable (EPV) guidelines require 10 to 20 observations per candidate predictor per class (N_min = 120 to 240 units for core features, or 716 to 1,432 total units across all 18 encoded dummy parameters). Our stratified 80/20 partitioning allocates N_train = 3,240 records (80%, containing 814 high emitters) with 5-fold cross-validation and preserves N_test = 810 records (20% unseen holdout, containing 204 high emitters and 606 low emitters), exceeding minimum requirements by 3× to 13× with zero data leakage.</w:t>
+      </w:r>
+    </w:p>
+    <w:p>
+      <w:pPr>
+        <w:spacing w:after="80" w:line="276" w:lineRule="auto"/>
+        <w:jc w:val="left"/>
+      </w:pPr>
+      <w:r>
+        <w:rPr>
+          <w:rFonts w:ascii="Times New Roman" w:hAnsi="Times New Roman"/>
+          <w:b/>
+          <w:sz w:val="22"/>
+        </w:rPr>
+        <w:t xml:space="preserve">RQ3 Minimum Sample Size Computation: </w:t>
+      </w:r>
+      <w:r>
+        <w:rPr>
+          <w:rFonts w:ascii="Times New Roman" w:hAnsi="Times New Roman"/>
+          <w:i w:val="0"/>
+          <w:sz w:val="22"/>
+        </w:rPr>
+        <w:t>For bivariate and multivariate Ordinary Least Squares (OLS) regression with m = 3 predictors (Unit_Age, Capacity_MW, Control_Count), detecting a small-to-medium partial effect (f² = 0.02 to 0.15, r ≈ 0.10–0.30) at α = 0.05 and 80% power requires N_min = 300 to 782 records (and Green's rule of N ≥ 50 + 8m = 74). Executing OLS across all N = 4,050 units (df = 4,046) exceeds the upper threshold by &gt; 5×.</w:t>
+      </w:r>
+    </w:p>
+    <w:p>
+      <w:pPr>
+        <w:spacing w:after="160" w:line="276" w:lineRule="auto"/>
+        <w:jc w:val="left"/>
+      </w:pPr>
+      <w:r>
+        <w:rPr>
+          <w:rFonts w:ascii="Times New Roman" w:hAnsi="Times New Roman"/>
+          <w:b/>
+          <w:sz w:val="22"/>
+        </w:rPr>
+        <w:t xml:space="preserve">RQ4 Minimum Sample Size Computation: </w:t>
+      </w:r>
+      <w:r>
+        <w:rPr>
+          <w:rFonts w:ascii="Times New Roman" w:hAnsi="Times New Roman"/>
+          <w:i w:val="0"/>
+          <w:sz w:val="22"/>
+        </w:rPr>
+        <w:t>For unsupervised K-Means clustering and 2D Principal Component Analysis (PCA) across d = 4 continuous operational dimensions and k = 4 clusters, multivariate segmentation heuristics require at least 10× to 70× the feature/cluster count (N_min ≥ 160 to 300 units). Executing K-Means across all N = 4,050 units exceeds this requirement by &gt; 13×. Table 4 summarizes the minimum sample size computation and exact record allocation per Research Question.</w:t>
+      </w:r>
+    </w:p>
+    <w:p>
+      <w:pPr>
+        <w:keepNext/>
+        <w:spacing w:before="240" w:after="40"/>
+      </w:pPr>
+      <w:r>
+        <w:rPr>
+          <w:rFonts w:ascii="Times New Roman" w:hAnsi="Times New Roman"/>
+          <w:b/>
+          <w:sz w:val="22"/>
+        </w:rPr>
+        <w:t>Table 4</w:t>
+      </w:r>
+    </w:p>
+    <w:p>
+      <w:pPr>
+        <w:keepNext/>
+        <w:spacing w:before="0" w:after="120"/>
+      </w:pPr>
+      <w:r>
+        <w:rPr>
+          <w:rFonts w:ascii="Times New Roman" w:hAnsi="Times New Roman"/>
+          <w:i/>
+          <w:sz w:val="22"/>
+        </w:rPr>
+        <w:t>Minimum Sample Size Computation and Analytical Record Allocation per Research Question</w:t>
+      </w:r>
+    </w:p>
+    <w:tbl>
+      <w:tblPr>
+        <w:tblW w:type="auto" w:w="0"/>
+        <w:tblLook w:firstColumn="1" w:firstRow="1" w:lastColumn="0" w:lastRow="0" w:noHBand="0" w:noVBand="1" w:val="04A0"/>
+        <w:jc w:val="center"/>
+        <w:tblBorders>
+          <w:top w:val="single" w:sz="12" w:space="0" w:color="000000"/>
+          <w:bottom w:val="single" w:sz="12" w:space="0" w:color="000000"/>
+          <w:insideH w:val="single" w:sz="4" w:space="0" w:color="E5E5E5"/>
+          <w:insideV w:val="none"/>
+          <w:left w:val="none"/>
+          <w:right w:val="none"/>
+        </w:tblBorders>
+      </w:tblPr>
+      <w:tblGrid>
+        <w:gridCol w:w="1337"/>
+        <w:gridCol w:w="1337"/>
+        <w:gridCol w:w="1337"/>
+        <w:gridCol w:w="1337"/>
+        <w:gridCol w:w="1337"/>
+        <w:gridCol w:w="1337"/>
+        <w:gridCol w:w="1337"/>
+      </w:tblGrid>
+      <w:tr>
+        <w:trPr>
+          <w:tblHeader/>
+        </w:trPr>
+        <w:tc>
+          <w:tcPr>
+            <w:tcW w:type="dxa" w:w="1728"/>
+            <w:tcBorders>
+              <w:bottom w:val="single" w:sz="12" w:space="0" w:color="000000"/>
+            </w:tcBorders>
+            <w:shd w:fill="F4F6F8"/>
+          </w:tcPr>
+          <w:p>
+            <w:pPr>
+              <w:spacing w:before="60" w:after="60" w:line="240" w:lineRule="auto"/>
+              <w:jc w:val="center"/>
+            </w:pPr>
+            <w:r>
+              <w:rPr>
+                <w:rFonts w:ascii="Times New Roman" w:hAnsi="Times New Roman"/>
+                <w:b/>
+                <w:sz w:val="19"/>
+              </w:rPr>
+              <w:t>Research Question &amp; Scope</w:t>
+            </w:r>
+          </w:p>
+        </w:tc>
+        <w:tc>
+          <w:tcPr>
+            <w:tcW w:type="dxa" w:w="1584"/>
+            <w:tcBorders>
+              <w:bottom w:val="single" w:sz="12" w:space="0" w:color="000000"/>
+            </w:tcBorders>
+            <w:shd w:fill="F4F6F8"/>
+          </w:tcPr>
+          <w:p>
+            <w:pPr>
+              <w:spacing w:before="60" w:after="60" w:line="240" w:lineRule="auto"/>
+              <w:jc w:val="center"/>
+            </w:pPr>
+            <w:r>
+              <w:rPr>
+                <w:rFonts w:ascii="Times New Roman" w:hAnsi="Times New Roman"/>
+                <w:b/>
+                <w:sz w:val="19"/>
+              </w:rPr>
+              <w:t>Analytical Model</w:t>
+            </w:r>
+          </w:p>
+        </w:tc>
+        <w:tc>
+          <w:tcPr>
+            <w:tcW w:type="dxa" w:w="1152"/>
+            <w:tcBorders>
+              <w:bottom w:val="single" w:sz="12" w:space="0" w:color="000000"/>
+            </w:tcBorders>
+            <w:shd w:fill="F4F6F8"/>
+          </w:tcPr>
+          <w:p>
+            <w:pPr>
+              <w:spacing w:before="60" w:after="60" w:line="240" w:lineRule="auto"/>
+              <w:jc w:val="center"/>
+            </w:pPr>
+            <w:r>
+              <w:rPr>
+                <w:rFonts w:ascii="Times New Roman" w:hAnsi="Times New Roman"/>
+                <w:b/>
+                <w:sz w:val="19"/>
+              </w:rPr>
+              <w:t>Total Records</w:t>
+            </w:r>
+          </w:p>
+        </w:tc>
+        <w:tc>
+          <w:tcPr>
+            <w:tcW w:type="dxa" w:w="1296"/>
+            <w:tcBorders>
+              <w:bottom w:val="single" w:sz="12" w:space="0" w:color="000000"/>
+            </w:tcBorders>
+            <w:shd w:fill="F4F6F8"/>
+          </w:tcPr>
+          <w:p>
+            <w:pPr>
+              <w:spacing w:before="60" w:after="60" w:line="240" w:lineRule="auto"/>
+              <w:jc w:val="center"/>
+            </w:pPr>
+            <w:r>
+              <w:rPr>
+                <w:rFonts w:ascii="Times New Roman" w:hAnsi="Times New Roman"/>
+                <w:b/>
+                <w:sz w:val="19"/>
+              </w:rPr>
+              <w:t>Training Set</w:t>
+            </w:r>
+          </w:p>
+        </w:tc>
+        <w:tc>
+          <w:tcPr>
+            <w:tcW w:type="dxa" w:w="1584"/>
+            <w:tcBorders>
+              <w:bottom w:val="single" w:sz="12" w:space="0" w:color="000000"/>
+            </w:tcBorders>
+            <w:shd w:fill="F4F6F8"/>
+          </w:tcPr>
+          <w:p>
+            <w:pPr>
+              <w:spacing w:before="60" w:after="60" w:line="240" w:lineRule="auto"/>
+              <w:jc w:val="center"/>
+            </w:pPr>
+            <w:r>
+              <w:rPr>
+                <w:rFonts w:ascii="Times New Roman" w:hAnsi="Times New Roman"/>
+                <w:b/>
+                <w:sz w:val="19"/>
+              </w:rPr>
+              <w:t>Validation / Holdout</w:t>
+            </w:r>
+          </w:p>
+        </w:tc>
+        <w:tc>
+          <w:tcPr>
+            <w:tcW w:type="dxa" w:w="1440"/>
+            <w:tcBorders>
+              <w:bottom w:val="single" w:sz="12" w:space="0" w:color="000000"/>
+            </w:tcBorders>
+            <w:shd w:fill="F4F6F8"/>
+          </w:tcPr>
+          <w:p>
+            <w:pPr>
+              <w:spacing w:before="60" w:after="60" w:line="240" w:lineRule="auto"/>
+              <w:jc w:val="center"/>
+            </w:pPr>
+            <w:r>
+              <w:rPr>
+                <w:rFonts w:ascii="Times New Roman" w:hAnsi="Times New Roman"/>
+                <w:b/>
+                <w:sz w:val="19"/>
+              </w:rPr>
+              <w:t>Minimum Needed (Power)</w:t>
+            </w:r>
+          </w:p>
+        </w:tc>
+        <w:tc>
+          <w:tcPr>
+            <w:tcW w:type="dxa" w:w="1584"/>
+            <w:tcBorders>
+              <w:bottom w:val="single" w:sz="12" w:space="0" w:color="000000"/>
+            </w:tcBorders>
+            <w:shd w:fill="F4F6F8"/>
+          </w:tcPr>
+          <w:p>
+            <w:pPr>
+              <w:spacing w:before="60" w:after="60" w:line="240" w:lineRule="auto"/>
+              <w:jc w:val="center"/>
+            </w:pPr>
+            <w:r>
+              <w:rPr>
+                <w:rFonts w:ascii="Times New Roman" w:hAnsi="Times New Roman"/>
+                <w:b/>
+                <w:sz w:val="19"/>
+              </w:rPr>
+              <w:t>Statistical Power Evaluation</w:t>
+            </w:r>
+          </w:p>
+        </w:tc>
+      </w:tr>
+      <w:tr>
+        <w:tc>
+          <w:tcPr>
+            <w:tcW w:type="dxa" w:w="1728"/>
+          </w:tcPr>
+          <w:p>
+            <w:pPr>
+              <w:spacing w:before="40" w:after="40" w:line="252" w:lineRule="auto"/>
+              <w:jc w:val="left"/>
+            </w:pPr>
+            <w:r>
+              <w:rPr>
+                <w:rFonts w:ascii="Times New Roman" w:hAnsi="Times New Roman"/>
+                <w:sz w:val="18"/>
+              </w:rPr>
+              <w:t>RQ1: Emission &amp; Heat Input Variability across Fuel Types</w:t>
+            </w:r>
+          </w:p>
+        </w:tc>
+        <w:tc>
+          <w:tcPr>
+            <w:tcW w:type="dxa" w:w="1584"/>
+          </w:tcPr>
+          <w:p>
+            <w:pPr>
+              <w:spacing w:before="40" w:after="40" w:line="252" w:lineRule="auto"/>
+              <w:jc w:val="left"/>
+            </w:pPr>
+            <w:r>
+              <w:rPr>
+                <w:rFonts w:ascii="Times New Roman" w:hAnsi="Times New Roman"/>
+                <w:sz w:val="18"/>
+              </w:rPr>
+              <w:t>One-Way ANOVA &amp; Kruskal-Wallis Test</w:t>
+            </w:r>
+          </w:p>
+        </w:tc>
+        <w:tc>
+          <w:tcPr>
+            <w:tcW w:type="dxa" w:w="1152"/>
+          </w:tcPr>
+          <w:p>
+            <w:pPr>
+              <w:spacing w:before="40" w:after="40" w:line="252" w:lineRule="auto"/>
+              <w:jc w:val="left"/>
+            </w:pPr>
+            <w:r>
+              <w:rPr>
+                <w:rFonts w:ascii="Times New Roman" w:hAnsi="Times New Roman"/>
+                <w:sz w:val="18"/>
+              </w:rPr>
+              <w:t>4,050 records (100%)</w:t>
+            </w:r>
+          </w:p>
+        </w:tc>
+        <w:tc>
+          <w:tcPr>
+            <w:tcW w:type="dxa" w:w="1296"/>
+          </w:tcPr>
+          <w:p>
+            <w:pPr>
+              <w:spacing w:before="40" w:after="40" w:line="252" w:lineRule="auto"/>
+              <w:jc w:val="left"/>
+            </w:pPr>
+            <w:r>
+              <w:rPr>
+                <w:rFonts w:ascii="Times New Roman" w:hAnsi="Times New Roman"/>
+                <w:sz w:val="18"/>
+              </w:rPr>
+              <w:t>4,050 records (Full population)</w:t>
+            </w:r>
+          </w:p>
+        </w:tc>
+        <w:tc>
+          <w:tcPr>
+            <w:tcW w:type="dxa" w:w="1584"/>
+          </w:tcPr>
+          <w:p>
+            <w:pPr>
+              <w:spacing w:before="40" w:after="40" w:line="252" w:lineRule="auto"/>
+              <w:jc w:val="left"/>
+            </w:pPr>
+            <w:r>
+              <w:rPr>
+                <w:rFonts w:ascii="Times New Roman" w:hAnsi="Times New Roman"/>
+                <w:sz w:val="18"/>
+              </w:rPr>
+              <w:t>N/A (Omnibus inference, df = 4, 4045)</w:t>
+            </w:r>
+          </w:p>
+        </w:tc>
+        <w:tc>
+          <w:tcPr>
+            <w:tcW w:type="dxa" w:w="1440"/>
+          </w:tcPr>
+          <w:p>
+            <w:pPr>
+              <w:spacing w:before="40" w:after="40" w:line="252" w:lineRule="auto"/>
+              <w:jc w:val="left"/>
+            </w:pPr>
+            <w:r>
+              <w:rPr>
+                <w:rFonts w:ascii="Times New Roman" w:hAnsi="Times New Roman"/>
+                <w:sz w:val="18"/>
+              </w:rPr>
+              <w:t>159–196 units (f = 0.25, α = 0.05, power = 80%)</w:t>
+            </w:r>
+          </w:p>
+        </w:tc>
+        <w:tc>
+          <w:tcPr>
+            <w:tcW w:type="dxa" w:w="1584"/>
+          </w:tcPr>
+          <w:p>
+            <w:pPr>
+              <w:spacing w:before="40" w:after="40" w:line="252" w:lineRule="auto"/>
+              <w:jc w:val="left"/>
+            </w:pPr>
+            <w:r>
+              <w:rPr>
+                <w:rFonts w:ascii="Times New Roman" w:hAnsi="Times New Roman"/>
+                <w:sz w:val="18"/>
+              </w:rPr>
+              <w:t>Exceeds minimum by &gt;20×; achieved power &gt;99.99%.</w:t>
+            </w:r>
+          </w:p>
+        </w:tc>
+      </w:tr>
+      <w:tr>
+        <w:tc>
+          <w:tcPr>
+            <w:tcW w:type="dxa" w:w="1728"/>
+            <w:shd w:fill="FAFAFA"/>
+          </w:tcPr>
+          <w:p>
+            <w:pPr>
+              <w:spacing w:before="40" w:after="40" w:line="252" w:lineRule="auto"/>
+              <w:jc w:val="left"/>
+            </w:pPr>
+            <w:r>
+              <w:rPr>
+                <w:rFonts w:ascii="Times New Roman" w:hAnsi="Times New Roman"/>
+                <w:sz w:val="18"/>
+              </w:rPr>
+              <w:t>RQ2: Predictive Classification of High-Emission Units</w:t>
+            </w:r>
+          </w:p>
+        </w:tc>
+        <w:tc>
+          <w:tcPr>
+            <w:tcW w:type="dxa" w:w="1584"/>
+            <w:shd w:fill="FAFAFA"/>
+          </w:tcPr>
+          <w:p>
+            <w:pPr>
+              <w:spacing w:before="40" w:after="40" w:line="252" w:lineRule="auto"/>
+              <w:jc w:val="left"/>
+            </w:pPr>
+            <w:r>
+              <w:rPr>
+                <w:rFonts w:ascii="Times New Roman" w:hAnsi="Times New Roman"/>
+                <w:sz w:val="18"/>
+              </w:rPr>
+              <w:t>Random Forest, Gradient Boosting, Logistic Regression</w:t>
+            </w:r>
+          </w:p>
+        </w:tc>
+        <w:tc>
+          <w:tcPr>
+            <w:tcW w:type="dxa" w:w="1152"/>
+            <w:shd w:fill="FAFAFA"/>
+          </w:tcPr>
+          <w:p>
+            <w:pPr>
+              <w:spacing w:before="40" w:after="40" w:line="252" w:lineRule="auto"/>
+              <w:jc w:val="left"/>
+            </w:pPr>
+            <w:r>
+              <w:rPr>
+                <w:rFonts w:ascii="Times New Roman" w:hAnsi="Times New Roman"/>
+                <w:sz w:val="18"/>
+              </w:rPr>
+              <w:t>4,050 records (100%)</w:t>
+            </w:r>
+          </w:p>
+        </w:tc>
+        <w:tc>
+          <w:tcPr>
+            <w:tcW w:type="dxa" w:w="1296"/>
+            <w:shd w:fill="FAFAFA"/>
+          </w:tcPr>
+          <w:p>
+            <w:pPr>
+              <w:spacing w:before="40" w:after="40" w:line="252" w:lineRule="auto"/>
+              <w:jc w:val="left"/>
+            </w:pPr>
+            <w:r>
+              <w:rPr>
+                <w:rFonts w:ascii="Times New Roman" w:hAnsi="Times New Roman"/>
+                <w:sz w:val="18"/>
+              </w:rPr>
+              <w:t>3,240 records (80% stratified)</w:t>
+            </w:r>
+          </w:p>
+        </w:tc>
+        <w:tc>
+          <w:tcPr>
+            <w:tcW w:type="dxa" w:w="1584"/>
+            <w:shd w:fill="FAFAFA"/>
+          </w:tcPr>
+          <w:p>
+            <w:pPr>
+              <w:spacing w:before="40" w:after="40" w:line="252" w:lineRule="auto"/>
+              <w:jc w:val="left"/>
+            </w:pPr>
+            <w:r>
+              <w:rPr>
+                <w:rFonts w:ascii="Times New Roman" w:hAnsi="Times New Roman"/>
+                <w:sz w:val="18"/>
+              </w:rPr>
+              <w:t>810 records (20% holdout: 204 High / 606 Low)</w:t>
+            </w:r>
+          </w:p>
+        </w:tc>
+        <w:tc>
+          <w:tcPr>
+            <w:tcW w:type="dxa" w:w="1440"/>
+            <w:shd w:fill="FAFAFA"/>
+          </w:tcPr>
+          <w:p>
+            <w:pPr>
+              <w:spacing w:before="40" w:after="40" w:line="252" w:lineRule="auto"/>
+              <w:jc w:val="left"/>
+            </w:pPr>
+            <w:r>
+              <w:rPr>
+                <w:rFonts w:ascii="Times New Roman" w:hAnsi="Times New Roman"/>
+                <w:sz w:val="18"/>
+              </w:rPr>
+              <w:t>120–240 core / 716–1,432 full (10–20 EPV rule)</w:t>
+            </w:r>
+          </w:p>
+        </w:tc>
+        <w:tc>
+          <w:tcPr>
+            <w:tcW w:type="dxa" w:w="1584"/>
+            <w:shd w:fill="FAFAFA"/>
+          </w:tcPr>
+          <w:p>
+            <w:pPr>
+              <w:spacing w:before="40" w:after="40" w:line="252" w:lineRule="auto"/>
+              <w:jc w:val="left"/>
+            </w:pPr>
+            <w:r>
+              <w:rPr>
+                <w:rFonts w:ascii="Times New Roman" w:hAnsi="Times New Roman"/>
+                <w:sz w:val="18"/>
+              </w:rPr>
+              <w:t>Exceeds minimum by 3×–13×; 5-fold CV prevents leakage.</w:t>
+            </w:r>
+          </w:p>
+        </w:tc>
+      </w:tr>
+      <w:tr>
+        <w:tc>
+          <w:tcPr>
+            <w:tcW w:type="dxa" w:w="1728"/>
+          </w:tcPr>
+          <w:p>
+            <w:pPr>
+              <w:spacing w:before="40" w:after="40" w:line="252" w:lineRule="auto"/>
+              <w:jc w:val="left"/>
+            </w:pPr>
+            <w:r>
+              <w:rPr>
+                <w:rFonts w:ascii="Times New Roman" w:hAnsi="Times New Roman"/>
+                <w:sz w:val="18"/>
+              </w:rPr>
+              <w:t>RQ3: Unit Age and Operational Thermal Intensity</w:t>
+            </w:r>
+          </w:p>
+        </w:tc>
+        <w:tc>
+          <w:tcPr>
+            <w:tcW w:type="dxa" w:w="1584"/>
+          </w:tcPr>
+          <w:p>
+            <w:pPr>
+              <w:spacing w:before="40" w:after="40" w:line="252" w:lineRule="auto"/>
+              <w:jc w:val="left"/>
+            </w:pPr>
+            <w:r>
+              <w:rPr>
+                <w:rFonts w:ascii="Times New Roman" w:hAnsi="Times New Roman"/>
+                <w:sz w:val="18"/>
+              </w:rPr>
+              <w:t>Bivariate &amp; Multivariate OLS Regressions</w:t>
+            </w:r>
+          </w:p>
+        </w:tc>
+        <w:tc>
+          <w:tcPr>
+            <w:tcW w:type="dxa" w:w="1152"/>
+          </w:tcPr>
+          <w:p>
+            <w:pPr>
+              <w:spacing w:before="40" w:after="40" w:line="252" w:lineRule="auto"/>
+              <w:jc w:val="left"/>
+            </w:pPr>
+            <w:r>
+              <w:rPr>
+                <w:rFonts w:ascii="Times New Roman" w:hAnsi="Times New Roman"/>
+                <w:sz w:val="18"/>
+              </w:rPr>
+              <w:t>4,050 records (100%)</w:t>
+            </w:r>
+          </w:p>
+        </w:tc>
+        <w:tc>
+          <w:tcPr>
+            <w:tcW w:type="dxa" w:w="1296"/>
+          </w:tcPr>
+          <w:p>
+            <w:pPr>
+              <w:spacing w:before="40" w:after="40" w:line="252" w:lineRule="auto"/>
+              <w:jc w:val="left"/>
+            </w:pPr>
+            <w:r>
+              <w:rPr>
+                <w:rFonts w:ascii="Times New Roman" w:hAnsi="Times New Roman"/>
+                <w:sz w:val="18"/>
+              </w:rPr>
+              <w:t>4,050 records (Full population)</w:t>
+            </w:r>
+          </w:p>
+        </w:tc>
+        <w:tc>
+          <w:tcPr>
+            <w:tcW w:type="dxa" w:w="1584"/>
+          </w:tcPr>
+          <w:p>
+            <w:pPr>
+              <w:spacing w:before="40" w:after="40" w:line="252" w:lineRule="auto"/>
+              <w:jc w:val="left"/>
+            </w:pPr>
+            <w:r>
+              <w:rPr>
+                <w:rFonts w:ascii="Times New Roman" w:hAnsi="Times New Roman"/>
+                <w:sz w:val="18"/>
+              </w:rPr>
+              <w:t>N/A (df = 4,046; residual diagnostics)</w:t>
+            </w:r>
+          </w:p>
+        </w:tc>
+        <w:tc>
+          <w:tcPr>
+            <w:tcW w:type="dxa" w:w="1440"/>
+          </w:tcPr>
+          <w:p>
+            <w:pPr>
+              <w:spacing w:before="40" w:after="40" w:line="252" w:lineRule="auto"/>
+              <w:jc w:val="left"/>
+            </w:pPr>
+            <w:r>
+              <w:rPr>
+                <w:rFonts w:ascii="Times New Roman" w:hAnsi="Times New Roman"/>
+                <w:sz w:val="18"/>
+              </w:rPr>
+              <w:t>300–782 units (Small-medium effect, r ≈ 0.1–0.3)</w:t>
+            </w:r>
+          </w:p>
+        </w:tc>
+        <w:tc>
+          <w:tcPr>
+            <w:tcW w:type="dxa" w:w="1584"/>
+          </w:tcPr>
+          <w:p>
+            <w:pPr>
+              <w:spacing w:before="40" w:after="40" w:line="252" w:lineRule="auto"/>
+              <w:jc w:val="left"/>
+            </w:pPr>
+            <w:r>
+              <w:rPr>
+                <w:rFonts w:ascii="Times New Roman" w:hAnsi="Times New Roman"/>
+                <w:sz w:val="18"/>
+              </w:rPr>
+              <w:t>Exceeds minimum by &gt;5×; highly stable slope SEs.</w:t>
+            </w:r>
+          </w:p>
+        </w:tc>
+      </w:tr>
+      <w:tr>
+        <w:tc>
+          <w:tcPr>
+            <w:tcW w:type="dxa" w:w="1728"/>
+            <w:shd w:fill="FAFAFA"/>
+          </w:tcPr>
+          <w:p>
+            <w:pPr>
+              <w:spacing w:before="40" w:after="40" w:line="252" w:lineRule="auto"/>
+              <w:jc w:val="left"/>
+            </w:pPr>
+            <w:r>
+              <w:rPr>
+                <w:rFonts w:ascii="Times New Roman" w:hAnsi="Times New Roman"/>
+                <w:sz w:val="18"/>
+              </w:rPr>
+              <w:t>RQ4: Unsupervised Fleet Segmentation &amp; Archetype Profiling</w:t>
+            </w:r>
+          </w:p>
+        </w:tc>
+        <w:tc>
+          <w:tcPr>
+            <w:tcW w:type="dxa" w:w="1584"/>
+            <w:shd w:fill="FAFAFA"/>
+          </w:tcPr>
+          <w:p>
+            <w:pPr>
+              <w:spacing w:before="40" w:after="40" w:line="252" w:lineRule="auto"/>
+              <w:jc w:val="left"/>
+            </w:pPr>
+            <w:r>
+              <w:rPr>
+                <w:rFonts w:ascii="Times New Roman" w:hAnsi="Times New Roman"/>
+                <w:sz w:val="18"/>
+              </w:rPr>
+              <w:t>K-Means Clustering &amp; 2D Principal Component Analysis</w:t>
+            </w:r>
+          </w:p>
+        </w:tc>
+        <w:tc>
+          <w:tcPr>
+            <w:tcW w:type="dxa" w:w="1152"/>
+            <w:shd w:fill="FAFAFA"/>
+          </w:tcPr>
+          <w:p>
+            <w:pPr>
+              <w:spacing w:before="40" w:after="40" w:line="252" w:lineRule="auto"/>
+              <w:jc w:val="left"/>
+            </w:pPr>
+            <w:r>
+              <w:rPr>
+                <w:rFonts w:ascii="Times New Roman" w:hAnsi="Times New Roman"/>
+                <w:sz w:val="18"/>
+              </w:rPr>
+              <w:t>4,050 records (100%)</w:t>
+            </w:r>
+          </w:p>
+        </w:tc>
+        <w:tc>
+          <w:tcPr>
+            <w:tcW w:type="dxa" w:w="1296"/>
+            <w:shd w:fill="FAFAFA"/>
+          </w:tcPr>
+          <w:p>
+            <w:pPr>
+              <w:spacing w:before="40" w:after="40" w:line="252" w:lineRule="auto"/>
+              <w:jc w:val="left"/>
+            </w:pPr>
+            <w:r>
+              <w:rPr>
+                <w:rFonts w:ascii="Times New Roman" w:hAnsi="Times New Roman"/>
+                <w:sz w:val="18"/>
+              </w:rPr>
+              <w:t>4,050 records (Full population)</w:t>
+            </w:r>
+          </w:p>
+        </w:tc>
+        <w:tc>
+          <w:tcPr>
+            <w:tcW w:type="dxa" w:w="1584"/>
+            <w:shd w:fill="FAFAFA"/>
+          </w:tcPr>
+          <w:p>
+            <w:pPr>
+              <w:spacing w:before="40" w:after="40" w:line="252" w:lineRule="auto"/>
+              <w:jc w:val="left"/>
+            </w:pPr>
+            <w:r>
+              <w:rPr>
+                <w:rFonts w:ascii="Times New Roman" w:hAnsi="Times New Roman"/>
+                <w:sz w:val="18"/>
+              </w:rPr>
+              <w:t>N/A (Fleet-wide centroid optimization)</w:t>
+            </w:r>
+          </w:p>
+        </w:tc>
+        <w:tc>
+          <w:tcPr>
+            <w:tcW w:type="dxa" w:w="1440"/>
+            <w:shd w:fill="FAFAFA"/>
+          </w:tcPr>
+          <w:p>
+            <w:pPr>
+              <w:spacing w:before="40" w:after="40" w:line="252" w:lineRule="auto"/>
+              <w:jc w:val="left"/>
+            </w:pPr>
+            <w:r>
+              <w:rPr>
+                <w:rFonts w:ascii="Times New Roman" w:hAnsi="Times New Roman"/>
+                <w:sz w:val="18"/>
+              </w:rPr>
+              <w:t>≥ 160–300 units (≥ 10×–70× feature/cluster rule)</w:t>
+            </w:r>
+          </w:p>
+        </w:tc>
+        <w:tc>
+          <w:tcPr>
+            <w:tcW w:type="dxa" w:w="1584"/>
+            <w:shd w:fill="FAFAFA"/>
+          </w:tcPr>
+          <w:p>
+            <w:pPr>
+              <w:spacing w:before="40" w:after="40" w:line="252" w:lineRule="auto"/>
+              <w:jc w:val="left"/>
+            </w:pPr>
+            <w:r>
+              <w:rPr>
+                <w:rFonts w:ascii="Times New Roman" w:hAnsi="Times New Roman"/>
+                <w:sz w:val="18"/>
+              </w:rPr>
+              <w:t>Exceeds minimum by &gt;13×; stable centroid separation.</w:t>
+            </w:r>
+          </w:p>
+        </w:tc>
+      </w:tr>
+    </w:tbl>
+    <w:p>
+      <w:pPr>
+        <w:spacing w:before="60" w:after="240"/>
+      </w:pPr>
+      <w:r>
+        <w:rPr>
+          <w:rFonts w:ascii="Times New Roman" w:hAnsi="Times New Roman"/>
+          <w:i/>
+          <w:sz w:val="18"/>
+        </w:rPr>
+        <w:t xml:space="preserve">Note. </w:t>
+      </w:r>
+      <w:r>
+        <w:rPr>
+          <w:rFonts w:ascii="Times New Roman" w:hAnsi="Times New Roman"/>
+          <w:sz w:val="18"/>
+        </w:rPr>
+        <w:t>Minimum sample size computations (α = 0.05, power = 80%) and record allocations across RQ1–RQ4 confirming 100% data retention (N = 4,050).</w:t>
+      </w:r>
+    </w:p>
+    <w:p>
+      <w:pPr>
+        <w:keepNext/>
+        <w:spacing w:before="240" w:after="120"/>
+        <w:jc w:val="left"/>
+      </w:pPr>
+      <w:r>
+        <w:rPr>
+          <w:rFonts w:ascii="Times New Roman" w:hAnsi="Times New Roman"/>
+          <w:b/>
+          <w:color w:val="19375F"/>
+          <w:sz w:val="24"/>
+        </w:rPr>
+        <w:t>Exploratory Data Analysis (EDA) Results, Visualizations, and Respective Insights</w:t>
+      </w:r>
+    </w:p>
+    <w:p>
+      <w:pPr>
+        <w:spacing w:after="120" w:line="276" w:lineRule="auto"/>
+        <w:jc w:val="left"/>
+      </w:pPr>
+      <w:r>
+        <w:rPr>
+          <w:rFonts w:ascii="Times New Roman" w:hAnsi="Times New Roman"/>
+          <w:i w:val="0"/>
+          <w:sz w:val="22"/>
+        </w:rPr>
+        <w:t>Exploratory data analysis was conducted to uncover fundamental empirical patterns, distributional properties, and inter-variable dependencies across the U.S. generating fleet. Emphasis is placed on the direct operational and regulatory interpretation of visualizations and tables, each of which is explicitly referenced and synthesized in the text.</w:t>
       </w:r>
     </w:p>
     <w:p>

</xml_diff>

<commit_message>
Remove Screenshots / Evidence section and repository directory architecture tree from Interim Report
</commit_message>
<xml_diff>
--- a/reports/QM 640_Interim_Report_DhananjayVerma-0291493.docx
+++ b/reports/QM 640_Interim_Report_DhananjayVerma-0291493.docx
@@ -5544,138 +5544,6 @@
           <w:sz w:val="22"/>
         </w:rPr>
         <w:t>https://github.com/djmsritai-tech/QM640-Data-Analytics-Capstone/tree/main/scripts (and https://github.com/djmsritai-tech/QM640-Data-Analytics-Capstone/blob/main/QM640_Capstone_Analytics_Notebook_DhananjayVerma_0291493.ipynb)</w:t>
-      </w:r>
-    </w:p>
-    <w:p>
-      <w:pPr>
-        <w:keepNext/>
-        <w:spacing w:before="240" w:after="120"/>
-        <w:jc w:val="left"/>
-      </w:pPr>
-      <w:r>
-        <w:rPr>
-          <w:rFonts w:ascii="Times New Roman" w:hAnsi="Times New Roman"/>
-          <w:b/>
-          <w:color w:val="19375F"/>
-          <w:sz w:val="24"/>
-        </w:rPr>
-        <w:t>Screenshots / Evidence (as required)</w:t>
-      </w:r>
-    </w:p>
-    <w:p>
-      <w:pPr>
-        <w:spacing w:after="120" w:line="276" w:lineRule="auto"/>
-        <w:jc w:val="left"/>
-      </w:pPr>
-      <w:r>
-        <w:rPr>
-          <w:rFonts w:ascii="Times New Roman" w:hAnsi="Times New Roman"/>
-          <w:i w:val="0"/>
-          <w:sz w:val="22"/>
-        </w:rPr>
-        <w:t>To satisfy the academic audit requirement, the file and directory architecture of the capstone project repository is structured hierarchically as depicted below:</w:t>
-      </w:r>
-    </w:p>
-    <w:p>
-      <w:pPr>
-        <w:spacing w:before="120" w:after="160" w:line="276" w:lineRule="auto"/>
-        <w:ind w:left="576" w:right="576"/>
-      </w:pPr>
-      <w:r>
-        <w:rPr>
-          <w:rFonts w:ascii="Times New Roman" w:hAnsi="Times New Roman"/>
-          <w:b/>
-          <w:color w:val="1E4678"/>
-          <w:sz w:val="20"/>
-        </w:rPr>
-        <w:t>Repository Directory Architecture:</w:t>
-        <w:br/>
-      </w:r>
-      <w:r>
-        <w:rPr>
-          <w:rFonts w:ascii="Times New Roman" w:hAnsi="Times New Roman"/>
-          <w:i/>
-          <w:sz w:val="20"/>
-        </w:rPr>
-        <w:t>QM640-Data-Analytics-Capstone/</w:t>
-        <w:br/>
-        <w:t>│</w:t>
-        <w:br/>
-        <w:t>├── data/</w:t>
-        <w:br/>
-        <w:t>│   ├── raw/</w:t>
-        <w:br/>
-        <w:t>│   │   └── facility-2025.csv             [Raw EPA CAMPD dataset: 4,050 rows, 30 columns]</w:t>
-        <w:br/>
-        <w:t>│   └── processed/</w:t>
-        <w:br/>
-        <w:t>│       └── facility_clean_processed.csv  [Engineered dataset: 4,050 rows, 45 columns]</w:t>
-        <w:br/>
-        <w:t>│</w:t>
-        <w:br/>
-        <w:t>├── scripts/</w:t>
-        <w:br/>
-        <w:t>│   ├── dhananjay_final_capston_report_analytics.py [End-to-end Python statistical &amp; ML pipeline]</w:t>
-        <w:br/>
-        <w:t>│   ├── build_full_interim_report.py                [APA 7 Interim Report generation script]</w:t>
-        <w:br/>
-        <w:t>│   ├── build_full_final_report.py                  [APA 7 Final Report generation script]</w:t>
-        <w:br/>
-        <w:t>│   └── QM640_Capstone_Analytics_Notebook_DhananjayVerma_0291493.ipynb [Runnable Jupyter Notebook]</w:t>
-        <w:br/>
-        <w:t>│</w:t>
-        <w:br/>
-        <w:t>├── outputs/</w:t>
-        <w:br/>
-        <w:t>│   ├── analytics_results.json            [Complete JSON export of test statistics &amp; metrics]</w:t>
-        <w:br/>
-        <w:t>│   └── figures/                          [11 APA 7 publication figures (300 DPI)]</w:t>
-        <w:br/>
-        <w:t>│       ├── figure0_system_architecture.png</w:t>
-        <w:br/>
-        <w:t>│       ├── figure1_fuel_emission_boxplot.png</w:t>
-        <w:br/>
-        <w:t>│       ├── figure2_unit_type_distribution.png</w:t>
-        <w:br/>
-        <w:t>│       ├── figure3_controls_by_fuel.png</w:t>
-        <w:br/>
-        <w:t>│       ├── figure4_correlation_heatmap.png</w:t>
-        <w:br/>
-        <w:t>│       ├── figure5_age_vs_heat_input_scatter.png</w:t>
-        <w:br/>
-        <w:t>│       ├── figure6_roc_curves.png</w:t>
-        <w:br/>
-        <w:t>│       ├── figure7_confusion_matrices.png</w:t>
-        <w:br/>
-        <w:t>│       ├── figure8_feature_importance.png</w:t>
-        <w:br/>
-        <w:t>│       ├── figure9_kmeans_elbow_silhouette.png</w:t>
-        <w:br/>
-        <w:t>│       └── figure10_pca_clusters.png</w:t>
-        <w:br/>
-        <w:t>│</w:t>
-        <w:br/>
-        <w:t>├── reports/</w:t>
-        <w:br/>
-        <w:t>│   ├── QM 640_Final_Report_DhananjayVerma-0291493.docx    [Standalone 40-page Final Report (.docx)]</w:t>
-        <w:br/>
-        <w:t>│   ├── QM 640_Final_Report_DhananjayVerma-0291493.pdf     [Standalone Compiled Final Report (.pdf)]</w:t>
-        <w:br/>
-        <w:t>│   ├── QM 640_Interim_Report_DhananjayVerma-0291493.docx  [Standalone 32-page Interim Report (.docx)]</w:t>
-        <w:br/>
-        <w:t>│   ├── QM 640_Interim_Report_DhananjayVerma-0291493.pdf   [Standalone Compiled Interim Report (.pdf)]</w:t>
-        <w:br/>
-        <w:t>│   └── QM640_Capstone_Synopsis_DhananjayVerma-0291493.docx [Approved Capstone Synopsis]</w:t>
-        <w:br/>
-        <w:t>│</w:t>
-        <w:br/>
-        <w:t>├── QM640_Capstone_Analytics_Notebook_DhananjayVerma_0291493.ipynb [Root Runnable Jupyter Notebook]</w:t>
-        <w:br/>
-        <w:t>├── requirements.txt                      [Python environment package requirements]</w:t>
-        <w:br/>
-        <w:t>├── .gitignore                            [Standard git exclusion rules]</w:t>
-        <w:br/>
-        <w:t>└── README.md                             [Comprehensive project documentation]</w:t>
       </w:r>
     </w:p>
     <w:p>

</xml_diff>